<commit_message>
Lots of refactoring, documentation updated
</commit_message>
<xml_diff>
--- a/documentation.docx
+++ b/documentation.docx
@@ -4,14 +4,11 @@
   <w:body>
     <w:p>
       <w:pPr>
-        <w:spacing w:after="0"/>
         <w:jc w:val="center"/>
         <w:rPr>
           <w:rFonts w:ascii="Lucida Bright" w:hAnsi="Lucida Bright"/>
           <w:b/>
           <w:bCs/>
-          <w:sz w:val="32"/>
-          <w:szCs w:val="32"/>
         </w:rPr>
       </w:pPr>
       <w:r>
@@ -19,44 +16,34 @@
           <w:rFonts w:ascii="Lucida Bright" w:hAnsi="Lucida Bright"/>
           <w:b/>
           <w:bCs/>
-          <w:sz w:val="32"/>
-          <w:szCs w:val="32"/>
-        </w:rPr>
-        <w:t>ASTROSURFER</w:t>
+        </w:rPr>
+        <w:t>ASTROSURFER – v3.0</w:t>
       </w:r>
       <w:r>
         <w:rPr>
           <w:rFonts w:ascii="Lucida Bright" w:hAnsi="Lucida Bright"/>
           <w:b/>
           <w:bCs/>
-          <w:sz w:val="32"/>
-          <w:szCs w:val="32"/>
-        </w:rPr>
-        <w:t xml:space="preserve"> – v3.01</w:t>
-      </w:r>
-    </w:p>
-    <w:p>
-      <w:pPr>
-        <w:spacing w:after="0"/>
+        </w:rPr>
+        <w:t>2</w:t>
+      </w:r>
+    </w:p>
+    <w:p>
+      <w:pPr>
         <w:jc w:val="center"/>
         <w:rPr>
           <w:rFonts w:ascii="Lucida Bright" w:hAnsi="Lucida Bright"/>
-          <w:sz w:val="32"/>
-          <w:szCs w:val="32"/>
-        </w:rPr>
-      </w:pPr>
-      <w:r>
-        <w:rPr>
-          <w:rFonts w:ascii="Lucida Bright" w:hAnsi="Lucida Bright"/>
-          <w:sz w:val="32"/>
-          <w:szCs w:val="32"/>
+        </w:rPr>
+      </w:pPr>
+      <w:r>
+        <w:rPr>
+          <w:rFonts w:ascii="Lucida Bright" w:hAnsi="Lucida Bright"/>
         </w:rPr>
         <w:t>By Griffin Shea</w:t>
       </w:r>
     </w:p>
     <w:p>
       <w:pPr>
-        <w:spacing w:after="0"/>
         <w:jc w:val="center"/>
         <w:rPr>
           <w:rFonts w:ascii="Lucida Bright" w:hAnsi="Lucida Bright"/>
@@ -65,7 +52,6 @@
     </w:p>
     <w:p>
       <w:pPr>
-        <w:spacing w:after="0"/>
         <w:rPr>
           <w:rFonts w:ascii="Lucida Bright" w:hAnsi="Lucida Bright"/>
           <w:b/>
@@ -83,15 +69,6 @@
     </w:p>
     <w:p>
       <w:pPr>
-        <w:spacing w:after="0"/>
-        <w:rPr>
-          <w:rFonts w:ascii="Lucida Bright" w:hAnsi="Lucida Bright"/>
-        </w:rPr>
-      </w:pPr>
-    </w:p>
-    <w:p>
-      <w:pPr>
-        <w:spacing w:after="0"/>
         <w:rPr>
           <w:rFonts w:ascii="Lucida Bright" w:hAnsi="Lucida Bright"/>
         </w:rPr>
@@ -127,15 +104,6 @@
     </w:p>
     <w:p>
       <w:pPr>
-        <w:spacing w:after="0"/>
-        <w:rPr>
-          <w:rFonts w:ascii="Lucida Bright" w:hAnsi="Lucida Bright"/>
-        </w:rPr>
-      </w:pPr>
-    </w:p>
-    <w:p>
-      <w:pPr>
-        <w:spacing w:after="0"/>
         <w:rPr>
           <w:rFonts w:ascii="Lucida Bright" w:hAnsi="Lucida Bright"/>
         </w:rPr>
@@ -172,61 +140,7 @@
         <w:rPr>
           <w:rFonts w:ascii="Lucida Bright" w:hAnsi="Lucida Bright"/>
         </w:rPr>
-        <w:t>. This document is intended as a guide to the codebase and an introduction to its architectural design. It will be a work in progress so expect incompleteness. I feel that it may provide</w:t>
-      </w:r>
-      <w:r>
-        <w:rPr>
-          <w:rFonts w:ascii="Lucida Bright" w:hAnsi="Lucida Bright"/>
-        </w:rPr>
-        <w:t xml:space="preserve"> a good </w:t>
-      </w:r>
-      <w:r>
-        <w:rPr>
-          <w:rFonts w:ascii="Lucida Bright" w:hAnsi="Lucida Bright"/>
-        </w:rPr>
-        <w:t>reference</w:t>
-      </w:r>
-      <w:r>
-        <w:rPr>
-          <w:rFonts w:ascii="Lucida Bright" w:hAnsi="Lucida Bright"/>
-        </w:rPr>
-        <w:t xml:space="preserve"> for </w:t>
-      </w:r>
-      <w:r>
-        <w:rPr>
-          <w:rFonts w:ascii="Lucida Bright" w:hAnsi="Lucida Bright"/>
-        </w:rPr>
-        <w:t xml:space="preserve">novice programmers interested in learning to </w:t>
-      </w:r>
-      <w:r>
-        <w:rPr>
-          <w:rFonts w:ascii="Lucida Bright" w:hAnsi="Lucida Bright"/>
-        </w:rPr>
-        <w:t xml:space="preserve">write </w:t>
-      </w:r>
-      <w:r>
-        <w:rPr>
-          <w:rFonts w:ascii="Lucida Bright" w:hAnsi="Lucida Bright"/>
-        </w:rPr>
-        <w:t>code for real-time 3D games</w:t>
-      </w:r>
-      <w:r>
-        <w:rPr>
-          <w:rFonts w:ascii="Lucida Bright" w:hAnsi="Lucida Bright"/>
-        </w:rPr>
-        <w:t xml:space="preserve">. </w:t>
-      </w:r>
-      <w:r>
-        <w:rPr>
-          <w:rFonts w:ascii="Lucida Bright" w:hAnsi="Lucida Bright"/>
-        </w:rPr>
-        <w:t>If you’re interested in this project, feel free to contact me at</w:t>
-      </w:r>
-      <w:r>
-        <w:rPr>
-          <w:rFonts w:ascii="Lucida Bright" w:hAnsi="Lucida Bright"/>
-        </w:rPr>
-        <w:t xml:space="preserve"> </w:t>
+        <w:t xml:space="preserve">. This document is intended as a guide to the codebase and an introduction to its architectural design. It will be a work in progress so expect incompleteness. I feel that it may provide a good reference for novice programmers interested in learning to write code for real-time 3D games. If you’re interested in this project, feel free to contact me at </w:t>
       </w:r>
       <w:hyperlink r:id="rId5" w:history="1">
         <w:r>
@@ -246,15 +160,13 @@
     </w:p>
     <w:p>
       <w:pPr>
-        <w:spacing w:after="0"/>
-        <w:rPr>
-          <w:rFonts w:ascii="Lucida Bright" w:hAnsi="Lucida Bright"/>
-        </w:rPr>
-      </w:pPr>
-    </w:p>
-    <w:p>
-      <w:pPr>
-        <w:spacing w:after="0"/>
+        <w:rPr>
+          <w:rFonts w:ascii="Lucida Bright" w:hAnsi="Lucida Bright"/>
+        </w:rPr>
+      </w:pPr>
+    </w:p>
+    <w:p>
+      <w:pPr>
         <w:rPr>
           <w:rFonts w:ascii="Lucida Bright" w:hAnsi="Lucida Bright"/>
           <w:b/>
@@ -272,48 +184,321 @@
     </w:p>
     <w:p>
       <w:pPr>
+        <w:rPr>
+          <w:rFonts w:ascii="Lucida Bright" w:hAnsi="Lucida Bright"/>
+        </w:rPr>
+      </w:pPr>
+      <w:r>
+        <w:rPr>
+          <w:rFonts w:ascii="Lucida Bright" w:hAnsi="Lucida Bright"/>
+        </w:rPr>
+        <w:t>This project makes use of six external libraries. They are:</w:t>
+      </w:r>
+    </w:p>
+    <w:p>
+      <w:pPr>
+        <w:pStyle w:val="ListParagraph"/>
+        <w:numPr>
+          <w:ilvl w:val="0"/>
+          <w:numId w:val="7"/>
+        </w:numPr>
+        <w:rPr>
+          <w:rFonts w:ascii="Lucida Bright" w:hAnsi="Lucida Bright"/>
+        </w:rPr>
+      </w:pPr>
+      <w:proofErr w:type="spellStart"/>
+      <w:r>
+        <w:rPr>
+          <w:rFonts w:ascii="Lucida Bright" w:hAnsi="Lucida Bright"/>
+        </w:rPr>
+        <w:t>PyGame</w:t>
+      </w:r>
+      <w:proofErr w:type="spellEnd"/>
+      <w:r>
+        <w:rPr>
+          <w:rFonts w:ascii="Lucida Bright" w:hAnsi="Lucida Bright"/>
+        </w:rPr>
+        <w:t xml:space="preserve"> – opens the game window and collects user input (https://www.pygame.org/)</w:t>
+      </w:r>
+    </w:p>
+    <w:p>
+      <w:pPr>
+        <w:pStyle w:val="ListParagraph"/>
+        <w:numPr>
+          <w:ilvl w:val="0"/>
+          <w:numId w:val="7"/>
+        </w:numPr>
+        <w:rPr>
+          <w:rFonts w:ascii="Lucida Bright" w:hAnsi="Lucida Bright"/>
+        </w:rPr>
+      </w:pPr>
+      <w:proofErr w:type="spellStart"/>
+      <w:r>
+        <w:rPr>
+          <w:rFonts w:ascii="Lucida Bright" w:hAnsi="Lucida Bright"/>
+        </w:rPr>
+        <w:t>PyOpenGL</w:t>
+      </w:r>
+      <w:proofErr w:type="spellEnd"/>
+      <w:r>
+        <w:rPr>
+          <w:rFonts w:ascii="Lucida Bright" w:hAnsi="Lucida Bright"/>
+        </w:rPr>
+        <w:t xml:space="preserve"> – 3D rendering using the GPU (https://mcfletch.github.io/pyopengl/documentation/index.html)</w:t>
+      </w:r>
+    </w:p>
+    <w:p>
+      <w:pPr>
+        <w:pStyle w:val="ListParagraph"/>
+        <w:numPr>
+          <w:ilvl w:val="0"/>
+          <w:numId w:val="7"/>
+        </w:numPr>
+        <w:rPr>
+          <w:rFonts w:ascii="Lucida Bright" w:hAnsi="Lucida Bright"/>
+        </w:rPr>
+      </w:pPr>
+      <w:proofErr w:type="spellStart"/>
+      <w:r>
+        <w:rPr>
+          <w:rFonts w:ascii="Lucida Bright" w:hAnsi="Lucida Bright"/>
+        </w:rPr>
+        <w:t>PyGLM</w:t>
+      </w:r>
+      <w:proofErr w:type="spellEnd"/>
+      <w:r>
+        <w:rPr>
+          <w:rFonts w:ascii="Lucida Bright" w:hAnsi="Lucida Bright"/>
+        </w:rPr>
+        <w:t xml:space="preserve"> – for vector, matrix, and quaternion mathematical operations (https://pypi.org/project/pyglm/)</w:t>
+      </w:r>
+    </w:p>
+    <w:p>
+      <w:pPr>
+        <w:pStyle w:val="ListParagraph"/>
+        <w:numPr>
+          <w:ilvl w:val="0"/>
+          <w:numId w:val="7"/>
+        </w:numPr>
+        <w:rPr>
+          <w:rFonts w:ascii="Lucida Bright" w:hAnsi="Lucida Bright"/>
+        </w:rPr>
+      </w:pPr>
+      <w:proofErr w:type="spellStart"/>
+      <w:r>
+        <w:rPr>
+          <w:rFonts w:ascii="Lucida Bright" w:hAnsi="Lucida Bright"/>
+        </w:rPr>
+        <w:t>Numpy</w:t>
+      </w:r>
+      <w:proofErr w:type="spellEnd"/>
+      <w:r>
+        <w:rPr>
+          <w:rFonts w:ascii="Lucida Bright" w:hAnsi="Lucida Bright"/>
+        </w:rPr>
+        <w:t xml:space="preserve"> – used in Renderer and </w:t>
+      </w:r>
+      <w:proofErr w:type="spellStart"/>
+      <w:r>
+        <w:rPr>
+          <w:rFonts w:ascii="Lucida Bright" w:hAnsi="Lucida Bright"/>
+        </w:rPr>
+        <w:t>ResourceManager</w:t>
+      </w:r>
+      <w:proofErr w:type="spellEnd"/>
+      <w:r>
+        <w:rPr>
+          <w:rFonts w:ascii="Lucida Bright" w:hAnsi="Lucida Bright"/>
+        </w:rPr>
+        <w:t xml:space="preserve"> classes to load data into OpenGL (https://pypi.org/project/numpy/</w:t>
+      </w:r>
+      <w:r>
+        <w:rPr>
+          <w:rFonts w:ascii="Lucida Bright" w:hAnsi="Lucida Bright"/>
+          <w:b/>
+          <w:bCs/>
+        </w:rPr>
+        <w:t>)</w:t>
+      </w:r>
+    </w:p>
+    <w:p>
+      <w:pPr>
+        <w:pStyle w:val="ListParagraph"/>
+        <w:numPr>
+          <w:ilvl w:val="0"/>
+          <w:numId w:val="7"/>
+        </w:numPr>
+        <w:rPr>
+          <w:rFonts w:ascii="Lucida Bright" w:hAnsi="Lucida Bright"/>
+        </w:rPr>
+      </w:pPr>
+      <w:proofErr w:type="spellStart"/>
+      <w:r>
+        <w:rPr>
+          <w:rFonts w:ascii="Lucida Bright" w:hAnsi="Lucida Bright"/>
+        </w:rPr>
+        <w:t>Attr</w:t>
+      </w:r>
+      <w:proofErr w:type="spellEnd"/>
+      <w:r>
+        <w:rPr>
+          <w:rFonts w:ascii="Lucida Bright" w:hAnsi="Lucida Bright"/>
+        </w:rPr>
+        <w:t xml:space="preserve"> – enables simpler definitions for game data properties (see Props below) (https://www.attrs.org/en/stable/)</w:t>
+      </w:r>
+    </w:p>
+    <w:p>
+      <w:pPr>
+        <w:pStyle w:val="ListParagraph"/>
+        <w:numPr>
+          <w:ilvl w:val="0"/>
+          <w:numId w:val="7"/>
+        </w:numPr>
+        <w:rPr>
+          <w:rFonts w:ascii="Lucida Bright" w:hAnsi="Lucida Bright"/>
+        </w:rPr>
+      </w:pPr>
+      <w:proofErr w:type="spellStart"/>
+      <w:r>
+        <w:rPr>
+          <w:rFonts w:ascii="Lucida Bright" w:hAnsi="Lucida Bright"/>
+        </w:rPr>
+        <w:t>TraceMalloc</w:t>
+      </w:r>
+      <w:proofErr w:type="spellEnd"/>
+      <w:r>
+        <w:rPr>
+          <w:rFonts w:ascii="Lucida Bright" w:hAnsi="Lucida Bright"/>
+        </w:rPr>
+        <w:t xml:space="preserve"> – to track memory and other debugging purposes (</w:t>
+      </w:r>
+      <w:hyperlink r:id="rId6" w:history="1">
+        <w:r>
+          <w:rPr>
+            <w:rStyle w:val="Hyperlink"/>
+            <w:rFonts w:ascii="Lucida Bright" w:hAnsi="Lucida Bright"/>
+          </w:rPr>
+          <w:t>https://docs.python.org/3/library/tracemalloc.html</w:t>
+        </w:r>
+      </w:hyperlink>
+      <w:r>
+        <w:rPr>
+          <w:rFonts w:ascii="Lucida Bright" w:hAnsi="Lucida Bright"/>
+        </w:rPr>
+        <w:t>)</w:t>
+      </w:r>
+    </w:p>
+    <w:p>
+      <w:pPr>
+        <w:rPr>
+          <w:rFonts w:ascii="Lucida Bright" w:hAnsi="Lucida Bright"/>
+        </w:rPr>
+      </w:pPr>
+      <w:r>
+        <w:rPr>
+          <w:rFonts w:ascii="Lucida Bright" w:hAnsi="Lucida Bright"/>
+        </w:rPr>
+        <w:br w:type="page"/>
+      </w:r>
+    </w:p>
+    <w:p>
+      <w:pPr>
+        <w:rPr>
+          <w:rFonts w:ascii="Lucida Bright" w:hAnsi="Lucida Bright"/>
+          <w:b/>
+          <w:bCs/>
+        </w:rPr>
+      </w:pPr>
+      <w:r>
+        <w:rPr>
+          <w:rFonts w:ascii="Lucida Bright" w:hAnsi="Lucida Bright"/>
+          <w:noProof/>
+        </w:rPr>
+        <w:lastRenderedPageBreak/>
+        <w:drawing>
+          <wp:anchor distT="0" distB="0" distL="114300" distR="114300" simplePos="0" relativeHeight="251660288" behindDoc="0" locked="0" layoutInCell="1" allowOverlap="1" wp14:anchorId="38D5D546" wp14:editId="33831F41">
+            <wp:simplePos x="0" y="0"/>
+            <wp:positionH relativeFrom="margin">
+              <wp:align>right</wp:align>
+            </wp:positionH>
+            <wp:positionV relativeFrom="paragraph">
+              <wp:posOffset>15902</wp:posOffset>
+            </wp:positionV>
+            <wp:extent cx="1860550" cy="3434715"/>
+            <wp:effectExtent l="0" t="0" r="6350" b="0"/>
+            <wp:wrapSquare wrapText="bothSides"/>
+            <wp:docPr id="938840488" name="Picture 10"/>
+            <wp:cNvGraphicFramePr>
+              <a:graphicFrameLocks xmlns:a="http://schemas.openxmlformats.org/drawingml/2006/main" noChangeAspect="1"/>
+            </wp:cNvGraphicFramePr>
+            <a:graphic xmlns:a="http://schemas.openxmlformats.org/drawingml/2006/main">
+              <a:graphicData uri="http://schemas.openxmlformats.org/drawingml/2006/picture">
+                <pic:pic xmlns:pic="http://schemas.openxmlformats.org/drawingml/2006/picture">
+                  <pic:nvPicPr>
+                    <pic:cNvPr id="0" name="Picture 10"/>
+                    <pic:cNvPicPr>
+                      <a:picLocks noChangeAspect="1" noChangeArrowheads="1"/>
+                    </pic:cNvPicPr>
+                  </pic:nvPicPr>
+                  <pic:blipFill>
+                    <a:blip r:embed="rId7">
+                      <a:extLst>
+                        <a:ext uri="{28A0092B-C50C-407E-A947-70E740481C1C}">
+                          <a14:useLocalDpi xmlns:a14="http://schemas.microsoft.com/office/drawing/2010/main" val="0"/>
+                        </a:ext>
+                      </a:extLst>
+                    </a:blip>
+                    <a:srcRect/>
+                    <a:stretch>
+                      <a:fillRect/>
+                    </a:stretch>
+                  </pic:blipFill>
+                  <pic:spPr bwMode="auto">
+                    <a:xfrm>
+                      <a:off x="0" y="0"/>
+                      <a:ext cx="1860550" cy="3434715"/>
+                    </a:xfrm>
+                    <a:prstGeom prst="rect">
+                      <a:avLst/>
+                    </a:prstGeom>
+                    <a:noFill/>
+                    <a:ln>
+                      <a:noFill/>
+                    </a:ln>
+                  </pic:spPr>
+                </pic:pic>
+              </a:graphicData>
+            </a:graphic>
+          </wp:anchor>
+        </w:drawing>
+      </w:r>
+      <w:r>
+        <w:rPr>
+          <w:rFonts w:ascii="Lucida Bright" w:hAnsi="Lucida Bright"/>
+          <w:b/>
+          <w:bCs/>
+        </w:rPr>
+        <w:t>FILE STRUCTURE</w:t>
+      </w:r>
+    </w:p>
+    <w:p>
+      <w:pPr>
         <w:spacing w:after="0"/>
         <w:rPr>
           <w:rFonts w:ascii="Lucida Bright" w:hAnsi="Lucida Bright"/>
         </w:rPr>
       </w:pPr>
-    </w:p>
-    <w:p>
-      <w:pPr>
-        <w:spacing w:after="0"/>
-        <w:rPr>
-          <w:rFonts w:ascii="Lucida Bright" w:hAnsi="Lucida Bright"/>
-        </w:rPr>
-      </w:pPr>
-      <w:r>
-        <w:rPr>
-          <w:rFonts w:ascii="Lucida Bright" w:hAnsi="Lucida Bright"/>
-        </w:rPr>
-        <w:t xml:space="preserve">This project </w:t>
-      </w:r>
-      <w:r>
-        <w:rPr>
-          <w:rFonts w:ascii="Lucida Bright" w:hAnsi="Lucida Bright"/>
-        </w:rPr>
-        <w:t>makes use of</w:t>
-      </w:r>
-      <w:r>
-        <w:rPr>
-          <w:rFonts w:ascii="Lucida Bright" w:hAnsi="Lucida Bright"/>
-        </w:rPr>
-        <w:t xml:space="preserve"> six external libraries</w:t>
-      </w:r>
-      <w:r>
-        <w:rPr>
-          <w:rFonts w:ascii="Lucida Bright" w:hAnsi="Lucida Bright"/>
-        </w:rPr>
-        <w:t>.</w:t>
-      </w:r>
-      <w:r>
-        <w:rPr>
-          <w:rFonts w:ascii="Lucida Bright" w:hAnsi="Lucida Bright"/>
-        </w:rPr>
-        <w:t xml:space="preserve"> They are:</w:t>
+      <w:r>
+        <w:rPr>
+          <w:rFonts w:ascii="Lucida Bright" w:hAnsi="Lucida Bright"/>
+        </w:rPr>
+        <w:t>Config, constants</w:t>
+      </w:r>
+      <w:r>
+        <w:rPr>
+          <w:rFonts w:ascii="Lucida Bright" w:hAnsi="Lucida Bright"/>
+        </w:rPr>
+        <w:t>:</w:t>
       </w:r>
     </w:p>
     <w:p>
@@ -328,37 +513,33 @@
           <w:rFonts w:ascii="Lucida Bright" w:hAnsi="Lucida Bright"/>
         </w:rPr>
       </w:pPr>
-      <w:proofErr w:type="spellStart"/>
-      <w:r>
-        <w:rPr>
-          <w:rFonts w:ascii="Lucida Bright" w:hAnsi="Lucida Bright"/>
-        </w:rPr>
-        <w:t>PyGame</w:t>
-      </w:r>
-      <w:proofErr w:type="spellEnd"/>
-      <w:r>
-        <w:rPr>
-          <w:rFonts w:ascii="Lucida Bright" w:hAnsi="Lucida Bright"/>
-        </w:rPr>
-        <w:t xml:space="preserve"> – opens the game window and collects user input</w:t>
-      </w:r>
-      <w:r>
-        <w:rPr>
-          <w:rFonts w:ascii="Lucida Bright" w:hAnsi="Lucida Bright"/>
-        </w:rPr>
-        <w:t xml:space="preserve"> (</w:t>
-      </w:r>
-      <w:r>
-        <w:rPr>
-          <w:rFonts w:ascii="Lucida Bright" w:hAnsi="Lucida Bright"/>
-        </w:rPr>
-        <w:t>https://www.pygame.org/</w:t>
-      </w:r>
-      <w:r>
-        <w:rPr>
-          <w:rFonts w:ascii="Lucida Bright" w:hAnsi="Lucida Bright"/>
-        </w:rPr>
-        <w:t>)</w:t>
+      <w:r>
+        <w:rPr>
+          <w:rFonts w:ascii="Lucida Bright" w:hAnsi="Lucida Bright"/>
+        </w:rPr>
+        <w:t>Imports several libraries and defines global settings and constants used by the rest of the engine code.</w:t>
+      </w:r>
+    </w:p>
+    <w:p>
+      <w:pPr>
+        <w:spacing w:after="0"/>
+        <w:rPr>
+          <w:rFonts w:ascii="Lucida Bright" w:hAnsi="Lucida Bright"/>
+        </w:rPr>
+      </w:pPr>
+      <w:proofErr w:type="spellStart"/>
+      <w:r>
+        <w:rPr>
+          <w:rFonts w:ascii="Lucida Bright" w:hAnsi="Lucida Bright"/>
+        </w:rPr>
+        <w:t>Glmh</w:t>
+      </w:r>
+      <w:proofErr w:type="spellEnd"/>
+      <w:r>
+        <w:rPr>
+          <w:rFonts w:ascii="Lucida Bright" w:hAnsi="Lucida Bright"/>
+        </w:rPr>
+        <w:t>:</w:t>
       </w:r>
     </w:p>
     <w:p>
@@ -373,37 +554,53 @@
           <w:rFonts w:ascii="Lucida Bright" w:hAnsi="Lucida Bright"/>
         </w:rPr>
       </w:pPr>
-      <w:proofErr w:type="spellStart"/>
-      <w:r>
-        <w:rPr>
-          <w:rFonts w:ascii="Lucida Bright" w:hAnsi="Lucida Bright"/>
-        </w:rPr>
-        <w:t>PyOpenGL</w:t>
-      </w:r>
-      <w:proofErr w:type="spellEnd"/>
-      <w:r>
-        <w:rPr>
-          <w:rFonts w:ascii="Lucida Bright" w:hAnsi="Lucida Bright"/>
-        </w:rPr>
-        <w:t xml:space="preserve"> – 3D rendering using the GPU</w:t>
-      </w:r>
-      <w:r>
-        <w:rPr>
-          <w:rFonts w:ascii="Lucida Bright" w:hAnsi="Lucida Bright"/>
-        </w:rPr>
-        <w:t xml:space="preserve"> (</w:t>
-      </w:r>
-      <w:r>
-        <w:rPr>
-          <w:rFonts w:ascii="Lucida Bright" w:hAnsi="Lucida Bright"/>
-        </w:rPr>
-        <w:t>https://mcfletch.github.io/pyopengl/documentation/index.html</w:t>
-      </w:r>
-      <w:r>
-        <w:rPr>
-          <w:rFonts w:ascii="Lucida Bright" w:hAnsi="Lucida Bright"/>
-        </w:rPr>
-        <w:t>)</w:t>
+      <w:r>
+        <w:rPr>
+          <w:rFonts w:ascii="Lucida Bright" w:hAnsi="Lucida Bright"/>
+        </w:rPr>
+        <w:t xml:space="preserve">A collection of mathematical functions building </w:t>
+      </w:r>
+      <w:proofErr w:type="gramStart"/>
+      <w:r>
+        <w:rPr>
+          <w:rFonts w:ascii="Lucida Bright" w:hAnsi="Lucida Bright"/>
+        </w:rPr>
+        <w:t>off of</w:t>
+      </w:r>
+      <w:proofErr w:type="gramEnd"/>
+      <w:r>
+        <w:rPr>
+          <w:rFonts w:ascii="Lucida Bright" w:hAnsi="Lucida Bright"/>
+        </w:rPr>
+        <w:t xml:space="preserve"> the </w:t>
+      </w:r>
+      <w:proofErr w:type="spellStart"/>
+      <w:r>
+        <w:rPr>
+          <w:rFonts w:ascii="Lucida Bright" w:hAnsi="Lucida Bright"/>
+        </w:rPr>
+        <w:t>glm</w:t>
+      </w:r>
+      <w:proofErr w:type="spellEnd"/>
+      <w:r>
+        <w:rPr>
+          <w:rFonts w:ascii="Lucida Bright" w:hAnsi="Lucida Bright"/>
+        </w:rPr>
+        <w:t xml:space="preserve"> library.</w:t>
+      </w:r>
+    </w:p>
+    <w:p>
+      <w:pPr>
+        <w:spacing w:after="0"/>
+        <w:rPr>
+          <w:rFonts w:ascii="Lucida Bright" w:hAnsi="Lucida Bright"/>
+        </w:rPr>
+      </w:pPr>
+      <w:r>
+        <w:rPr>
+          <w:rFonts w:ascii="Lucida Bright" w:hAnsi="Lucida Bright"/>
+        </w:rPr>
+        <w:t>Assets:</w:t>
       </w:r>
     </w:p>
     <w:p>
@@ -418,37 +615,51 @@
           <w:rFonts w:ascii="Lucida Bright" w:hAnsi="Lucida Bright"/>
         </w:rPr>
       </w:pPr>
-      <w:proofErr w:type="spellStart"/>
-      <w:r>
-        <w:rPr>
-          <w:rFonts w:ascii="Lucida Bright" w:hAnsi="Lucida Bright"/>
-        </w:rPr>
-        <w:t>PyGLM</w:t>
-      </w:r>
-      <w:proofErr w:type="spellEnd"/>
-      <w:r>
-        <w:rPr>
-          <w:rFonts w:ascii="Lucida Bright" w:hAnsi="Lucida Bright"/>
-        </w:rPr>
-        <w:t xml:space="preserve"> – for vector, matrix, and quaternion mathematical operations</w:t>
-      </w:r>
-      <w:r>
-        <w:rPr>
-          <w:rFonts w:ascii="Lucida Bright" w:hAnsi="Lucida Bright"/>
-        </w:rPr>
-        <w:t xml:space="preserve"> (</w:t>
-      </w:r>
-      <w:r>
-        <w:rPr>
-          <w:rFonts w:ascii="Lucida Bright" w:hAnsi="Lucida Bright"/>
-        </w:rPr>
-        <w:t>https://pypi.org/project/pyglm/</w:t>
-      </w:r>
-      <w:r>
-        <w:rPr>
-          <w:rFonts w:ascii="Lucida Bright" w:hAnsi="Lucida Bright"/>
-        </w:rPr>
-        <w:t>)</w:t>
+      <w:r>
+        <w:rPr>
+          <w:rFonts w:ascii="Lucida Bright" w:hAnsi="Lucida Bright"/>
+        </w:rPr>
+        <w:t>contains all the fonts, meshes (3D models, as obj files), textures (images), and shader files (</w:t>
+      </w:r>
+      <w:r>
+        <w:rPr>
+          <w:rFonts w:ascii="Lucida Bright" w:hAnsi="Lucida Bright"/>
+        </w:rPr>
+        <w:t>GLSL</w:t>
+      </w:r>
+      <w:r>
+        <w:rPr>
+          <w:rFonts w:ascii="Lucida Bright" w:hAnsi="Lucida Bright"/>
+        </w:rPr>
+        <w:t xml:space="preserve"> programs), needed for rendering the game. Also holds level files for building and running levels and scripts for game objects.</w:t>
+      </w:r>
+    </w:p>
+    <w:p>
+      <w:pPr>
+        <w:spacing w:after="0"/>
+        <w:rPr>
+          <w:rFonts w:ascii="Lucida Bright" w:hAnsi="Lucida Bright"/>
+        </w:rPr>
+      </w:pPr>
+    </w:p>
+    <w:p>
+      <w:pPr>
+        <w:spacing w:after="0"/>
+        <w:rPr>
+          <w:rFonts w:ascii="Lucida Bright" w:hAnsi="Lucida Bright"/>
+        </w:rPr>
+      </w:pPr>
+      <w:r>
+        <w:rPr>
+          <w:rFonts w:ascii="Lucida Bright" w:hAnsi="Lucida Bright"/>
+        </w:rPr>
+        <w:t>Main</w:t>
+      </w:r>
+      <w:r>
+        <w:rPr>
+          <w:rFonts w:ascii="Lucida Bright" w:hAnsi="Lucida Bright"/>
+        </w:rPr>
+        <w:t>:</w:t>
       </w:r>
     </w:p>
     <w:p>
@@ -463,53 +674,25 @@
           <w:rFonts w:ascii="Lucida Bright" w:hAnsi="Lucida Bright"/>
         </w:rPr>
       </w:pPr>
-      <w:proofErr w:type="spellStart"/>
-      <w:r>
-        <w:rPr>
-          <w:rFonts w:ascii="Lucida Bright" w:hAnsi="Lucida Bright"/>
-        </w:rPr>
-        <w:t>Numpy</w:t>
-      </w:r>
-      <w:proofErr w:type="spellEnd"/>
-      <w:r>
-        <w:rPr>
-          <w:rFonts w:ascii="Lucida Bright" w:hAnsi="Lucida Bright"/>
-        </w:rPr>
-        <w:t xml:space="preserve"> – used in Renderer and </w:t>
-      </w:r>
-      <w:proofErr w:type="spellStart"/>
-      <w:r>
-        <w:rPr>
-          <w:rFonts w:ascii="Lucida Bright" w:hAnsi="Lucida Bright"/>
-        </w:rPr>
-        <w:t>ResourceManager</w:t>
-      </w:r>
-      <w:proofErr w:type="spellEnd"/>
-      <w:r>
-        <w:rPr>
-          <w:rFonts w:ascii="Lucida Bright" w:hAnsi="Lucida Bright"/>
-        </w:rPr>
-        <w:t xml:space="preserve"> classes to load data into OpenGL</w:t>
-      </w:r>
-      <w:r>
-        <w:rPr>
-          <w:rFonts w:ascii="Lucida Bright" w:hAnsi="Lucida Bright"/>
-        </w:rPr>
-        <w:t xml:space="preserve"> (</w:t>
-      </w:r>
-      <w:r>
-        <w:rPr>
-          <w:rFonts w:ascii="Lucida Bright" w:hAnsi="Lucida Bright"/>
-        </w:rPr>
-        <w:t>https://pypi.org/project/numpy/</w:t>
-      </w:r>
-      <w:r>
-        <w:rPr>
-          <w:rFonts w:ascii="Lucida Bright" w:hAnsi="Lucida Bright"/>
-          <w:b/>
-          <w:bCs/>
-        </w:rPr>
-        <w:t>)</w:t>
+      <w:r>
+        <w:rPr>
+          <w:rFonts w:ascii="Lucida Bright" w:hAnsi="Lucida Bright"/>
+        </w:rPr>
+        <w:t>Main function to start the program.</w:t>
+      </w:r>
+    </w:p>
+    <w:p>
+      <w:pPr>
+        <w:spacing w:after="0"/>
+        <w:rPr>
+          <w:rFonts w:ascii="Lucida Bright" w:hAnsi="Lucida Bright"/>
+        </w:rPr>
+      </w:pPr>
+      <w:r>
+        <w:rPr>
+          <w:rFonts w:ascii="Lucida Bright" w:hAnsi="Lucida Bright"/>
+        </w:rPr>
+        <w:t>Controller:</w:t>
       </w:r>
     </w:p>
     <w:p>
@@ -524,61 +707,39 @@
           <w:rFonts w:ascii="Lucida Bright" w:hAnsi="Lucida Bright"/>
         </w:rPr>
       </w:pPr>
-      <w:proofErr w:type="spellStart"/>
-      <w:r>
-        <w:rPr>
-          <w:rFonts w:ascii="Lucida Bright" w:hAnsi="Lucida Bright"/>
-        </w:rPr>
-        <w:t>Attr</w:t>
-      </w:r>
-      <w:proofErr w:type="spellEnd"/>
-      <w:r>
-        <w:rPr>
-          <w:rFonts w:ascii="Lucida Bright" w:hAnsi="Lucida Bright"/>
-        </w:rPr>
-        <w:t xml:space="preserve"> – enables simpler definitions for game data properties (</w:t>
-      </w:r>
-      <w:r>
-        <w:rPr>
-          <w:rFonts w:ascii="Lucida Bright" w:hAnsi="Lucida Bright"/>
-        </w:rPr>
-        <w:t xml:space="preserve">see </w:t>
-      </w:r>
-      <w:r>
-        <w:rPr>
-          <w:rFonts w:ascii="Lucida Bright" w:hAnsi="Lucida Bright"/>
-        </w:rPr>
-        <w:t>Props</w:t>
-      </w:r>
-      <w:r>
-        <w:rPr>
-          <w:rFonts w:ascii="Lucida Bright" w:hAnsi="Lucida Bright"/>
-        </w:rPr>
-        <w:t xml:space="preserve"> below</w:t>
-      </w:r>
-      <w:r>
-        <w:rPr>
-          <w:rFonts w:ascii="Lucida Bright" w:hAnsi="Lucida Bright"/>
-        </w:rPr>
-        <w:t>)</w:t>
-      </w:r>
-      <w:r>
-        <w:rPr>
-          <w:rFonts w:ascii="Lucida Bright" w:hAnsi="Lucida Bright"/>
-        </w:rPr>
-        <w:t xml:space="preserve"> (</w:t>
-      </w:r>
-      <w:r>
-        <w:rPr>
-          <w:rFonts w:ascii="Lucida Bright" w:hAnsi="Lucida Bright"/>
-        </w:rPr>
-        <w:t>https://www.attrs.org/en/stable/</w:t>
-      </w:r>
-      <w:r>
-        <w:rPr>
-          <w:rFonts w:ascii="Lucida Bright" w:hAnsi="Lucida Bright"/>
-        </w:rPr>
-        <w:t>)</w:t>
+      <w:r>
+        <w:rPr>
+          <w:rFonts w:ascii="Lucida Bright" w:hAnsi="Lucida Bright"/>
+        </w:rPr>
+        <w:t xml:space="preserve">A static class that collects user input each frame using the </w:t>
+      </w:r>
+      <w:proofErr w:type="spellStart"/>
+      <w:r>
+        <w:rPr>
+          <w:rFonts w:ascii="Lucida Bright" w:hAnsi="Lucida Bright"/>
+        </w:rPr>
+        <w:t>pygame</w:t>
+      </w:r>
+      <w:proofErr w:type="spellEnd"/>
+      <w:r>
+        <w:rPr>
+          <w:rFonts w:ascii="Lucida Bright" w:hAnsi="Lucida Bright"/>
+        </w:rPr>
+        <w:t xml:space="preserve"> library.</w:t>
+      </w:r>
+    </w:p>
+    <w:p>
+      <w:pPr>
+        <w:spacing w:after="0"/>
+        <w:rPr>
+          <w:rFonts w:ascii="Lucida Bright" w:hAnsi="Lucida Bright"/>
+        </w:rPr>
+      </w:pPr>
+      <w:r>
+        <w:rPr>
+          <w:rFonts w:ascii="Lucida Bright" w:hAnsi="Lucida Bright"/>
+        </w:rPr>
+        <w:t>Renderer:</w:t>
       </w:r>
     </w:p>
     <w:p>
@@ -593,37 +754,25 @@
           <w:rFonts w:ascii="Lucida Bright" w:hAnsi="Lucida Bright"/>
         </w:rPr>
       </w:pPr>
-      <w:proofErr w:type="spellStart"/>
-      <w:r>
-        <w:rPr>
-          <w:rFonts w:ascii="Lucida Bright" w:hAnsi="Lucida Bright"/>
-        </w:rPr>
-        <w:t>TraceMalloc</w:t>
-      </w:r>
-      <w:proofErr w:type="spellEnd"/>
-      <w:r>
-        <w:rPr>
-          <w:rFonts w:ascii="Lucida Bright" w:hAnsi="Lucida Bright"/>
-        </w:rPr>
-        <w:t xml:space="preserve"> – to track memory and other debugging purposes</w:t>
-      </w:r>
-      <w:r>
-        <w:rPr>
-          <w:rFonts w:ascii="Lucida Bright" w:hAnsi="Lucida Bright"/>
-        </w:rPr>
-        <w:t xml:space="preserve"> (</w:t>
-      </w:r>
-      <w:r>
-        <w:rPr>
-          <w:rFonts w:ascii="Lucida Bright" w:hAnsi="Lucida Bright"/>
-        </w:rPr>
-        <w:t>https://docs.python.org/3/library/tracemalloc.html</w:t>
-      </w:r>
-      <w:r>
-        <w:rPr>
-          <w:rFonts w:ascii="Lucida Bright" w:hAnsi="Lucida Bright"/>
-        </w:rPr>
-        <w:t>)</w:t>
+      <w:r>
+        <w:rPr>
+          <w:rFonts w:ascii="Lucida Bright" w:hAnsi="Lucida Bright"/>
+        </w:rPr>
+        <w:t xml:space="preserve">Class used to render each frame using OpenGL and a </w:t>
+      </w:r>
+      <w:proofErr w:type="spellStart"/>
+      <w:r>
+        <w:rPr>
+          <w:rFonts w:ascii="Lucida Bright" w:hAnsi="Lucida Bright"/>
+        </w:rPr>
+        <w:t>pygame</w:t>
+      </w:r>
+      <w:proofErr w:type="spellEnd"/>
+      <w:r>
+        <w:rPr>
+          <w:rFonts w:ascii="Lucida Bright" w:hAnsi="Lucida Bright"/>
+        </w:rPr>
+        <w:t xml:space="preserve"> window.</w:t>
       </w:r>
     </w:p>
     <w:p>
@@ -633,9 +782,157 @@
           <w:rFonts w:ascii="Lucida Bright" w:hAnsi="Lucida Bright"/>
         </w:rPr>
       </w:pPr>
-    </w:p>
-    <w:p>
-      <w:pPr>
+      <w:proofErr w:type="spellStart"/>
+      <w:r>
+        <w:rPr>
+          <w:rFonts w:ascii="Lucida Bright" w:hAnsi="Lucida Bright"/>
+        </w:rPr>
+        <w:t>ResourceManager</w:t>
+      </w:r>
+      <w:proofErr w:type="spellEnd"/>
+      <w:r>
+        <w:rPr>
+          <w:rFonts w:ascii="Lucida Bright" w:hAnsi="Lucida Bright"/>
+        </w:rPr>
+        <w:t>:</w:t>
+      </w:r>
+    </w:p>
+    <w:p>
+      <w:pPr>
+        <w:pStyle w:val="ListParagraph"/>
+        <w:numPr>
+          <w:ilvl w:val="0"/>
+          <w:numId w:val="7"/>
+        </w:numPr>
+        <w:spacing w:after="0"/>
+        <w:rPr>
+          <w:rFonts w:ascii="Lucida Bright" w:hAnsi="Lucida Bright"/>
+        </w:rPr>
+      </w:pPr>
+      <w:r>
+        <w:rPr>
+          <w:rFonts w:ascii="Lucida Bright" w:hAnsi="Lucida Bright"/>
+        </w:rPr>
+        <w:t>Loads and stores asset data on the graphics card using OpenGL.</w:t>
+      </w:r>
+    </w:p>
+    <w:p>
+      <w:pPr>
+        <w:spacing w:after="0"/>
+        <w:rPr>
+          <w:rFonts w:ascii="Lucida Bright" w:hAnsi="Lucida Bright"/>
+        </w:rPr>
+      </w:pPr>
+      <w:proofErr w:type="spellStart"/>
+      <w:r>
+        <w:rPr>
+          <w:rFonts w:ascii="Lucida Bright" w:hAnsi="Lucida Bright"/>
+        </w:rPr>
+        <w:t>ShaderHelper</w:t>
+      </w:r>
+      <w:proofErr w:type="spellEnd"/>
+      <w:r>
+        <w:rPr>
+          <w:rFonts w:ascii="Lucida Bright" w:hAnsi="Lucida Bright"/>
+        </w:rPr>
+        <w:t>:</w:t>
+      </w:r>
+    </w:p>
+    <w:p>
+      <w:pPr>
+        <w:pStyle w:val="ListParagraph"/>
+        <w:numPr>
+          <w:ilvl w:val="0"/>
+          <w:numId w:val="7"/>
+        </w:numPr>
+        <w:spacing w:after="0"/>
+        <w:rPr>
+          <w:rFonts w:ascii="Lucida Bright" w:hAnsi="Lucida Bright"/>
+        </w:rPr>
+      </w:pPr>
+      <w:r>
+        <w:rPr>
+          <w:rFonts w:ascii="Lucida Bright" w:hAnsi="Lucida Bright"/>
+        </w:rPr>
+        <w:t xml:space="preserve">A class used in </w:t>
+      </w:r>
+      <w:proofErr w:type="spellStart"/>
+      <w:r>
+        <w:rPr>
+          <w:rFonts w:ascii="Lucida Bright" w:hAnsi="Lucida Bright"/>
+        </w:rPr>
+        <w:t>ResourceManager</w:t>
+      </w:r>
+      <w:proofErr w:type="spellEnd"/>
+      <w:r>
+        <w:rPr>
+          <w:rFonts w:ascii="Lucida Bright" w:hAnsi="Lucida Bright"/>
+        </w:rPr>
+        <w:t xml:space="preserve"> to compile GLSL shader programs.</w:t>
+      </w:r>
+    </w:p>
+    <w:p>
+      <w:pPr>
+        <w:spacing w:after="0"/>
+        <w:rPr>
+          <w:rFonts w:ascii="Lucida Bright" w:hAnsi="Lucida Bright"/>
+        </w:rPr>
+      </w:pPr>
+    </w:p>
+    <w:p>
+      <w:pPr>
+        <w:spacing w:after="0"/>
+        <w:rPr>
+          <w:rFonts w:ascii="Lucida Bright" w:hAnsi="Lucida Bright"/>
+        </w:rPr>
+      </w:pPr>
+      <w:r>
+        <w:rPr>
+          <w:rFonts w:ascii="Lucida Bright" w:hAnsi="Lucida Bright"/>
+        </w:rPr>
+        <w:t>Game:</w:t>
+      </w:r>
+    </w:p>
+    <w:p>
+      <w:pPr>
+        <w:pStyle w:val="ListParagraph"/>
+        <w:numPr>
+          <w:ilvl w:val="0"/>
+          <w:numId w:val="7"/>
+        </w:numPr>
+        <w:spacing w:after="0"/>
+        <w:rPr>
+          <w:rFonts w:ascii="Lucida Bright" w:hAnsi="Lucida Bright"/>
+        </w:rPr>
+      </w:pPr>
+      <w:r>
+        <w:rPr>
+          <w:rFonts w:ascii="Lucida Bright" w:hAnsi="Lucida Bright"/>
+        </w:rPr>
+        <w:t>Handles a basic menu and wraps an instance of Session</w:t>
+      </w:r>
+    </w:p>
+    <w:p>
+      <w:pPr>
+        <w:spacing w:after="0"/>
+        <w:rPr>
+          <w:rFonts w:ascii="Lucida Bright" w:hAnsi="Lucida Bright"/>
+        </w:rPr>
+      </w:pPr>
+      <w:r>
+        <w:rPr>
+          <w:rFonts w:ascii="Lucida Bright" w:hAnsi="Lucida Bright"/>
+        </w:rPr>
+        <w:t>Session:</w:t>
+      </w:r>
+    </w:p>
+    <w:p>
+      <w:pPr>
+        <w:pStyle w:val="ListParagraph"/>
+        <w:numPr>
+          <w:ilvl w:val="0"/>
+          <w:numId w:val="7"/>
+        </w:numPr>
         <w:spacing w:after="0"/>
         <w:rPr>
           <w:rFonts w:ascii="Lucida Bright" w:hAnsi="Lucida Bright"/>
@@ -643,84 +940,111 @@
           <w:bCs/>
         </w:rPr>
       </w:pPr>
-    </w:p>
-    <w:p>
-      <w:pPr>
-        <w:spacing w:after="0"/>
+      <w:r>
+        <w:rPr>
+          <w:rFonts w:ascii="Lucida Bright" w:hAnsi="Lucida Bright"/>
+        </w:rPr>
+        <w:t xml:space="preserve">Responsible for the main functions of running the game loop. Uses the files in Core. </w:t>
+      </w:r>
+      <w:r>
+        <w:rPr>
+          <w:rFonts w:ascii="Lucida Bright" w:hAnsi="Lucida Bright"/>
+        </w:rPr>
+        <w:t>U</w:t>
+      </w:r>
+      <w:r>
+        <w:rPr>
+          <w:rFonts w:ascii="Lucida Bright" w:hAnsi="Lucida Bright"/>
+        </w:rPr>
+        <w:t xml:space="preserve">ses </w:t>
+      </w:r>
+      <w:proofErr w:type="spellStart"/>
+      <w:r>
+        <w:rPr>
+          <w:rFonts w:ascii="Lucida Bright" w:hAnsi="Lucida Bright"/>
+        </w:rPr>
+        <w:t>MasterScript</w:t>
+      </w:r>
+      <w:proofErr w:type="spellEnd"/>
+      <w:r>
+        <w:rPr>
+          <w:rFonts w:ascii="Lucida Bright" w:hAnsi="Lucida Bright"/>
+        </w:rPr>
+        <w:t xml:space="preserve"> and </w:t>
+      </w:r>
+      <w:r>
+        <w:rPr>
+          <w:rFonts w:ascii="Lucida Bright" w:hAnsi="Lucida Bright"/>
+        </w:rPr>
+        <w:t>Painter</w:t>
+      </w:r>
+      <w:r>
+        <w:rPr>
+          <w:rFonts w:ascii="Lucida Bright" w:hAnsi="Lucida Bright"/>
+        </w:rPr>
+        <w:t xml:space="preserve"> classes to update and render the game data.</w:t>
+      </w:r>
+      <w:r>
+        <w:rPr>
+          <w:rFonts w:ascii="Lucida Bright" w:hAnsi="Lucida Bright"/>
+        </w:rPr>
+        <w:t xml:space="preserve"> The code in Systems is used by </w:t>
+      </w:r>
+      <w:proofErr w:type="spellStart"/>
+      <w:r>
+        <w:rPr>
+          <w:rFonts w:ascii="Lucida Bright" w:hAnsi="Lucida Bright"/>
+        </w:rPr>
+        <w:t>MasterScript</w:t>
+      </w:r>
+      <w:proofErr w:type="spellEnd"/>
+      <w:r>
+        <w:rPr>
+          <w:rFonts w:ascii="Lucida Bright" w:hAnsi="Lucida Bright"/>
+        </w:rPr>
+        <w:t>. Game data in contained by Index, which uses a dictionary to hold game objects defined by a key. Each game object is a combination of properties from the Props folder.</w:t>
+      </w:r>
+      <w:r>
         <w:rPr>
           <w:rFonts w:ascii="Lucida Bright" w:hAnsi="Lucida Bright"/>
           <w:b/>
           <w:bCs/>
         </w:rPr>
-      </w:pPr>
-    </w:p>
-    <w:p>
-      <w:pPr>
-        <w:spacing w:after="0"/>
+        <w:br w:type="page"/>
+      </w:r>
+    </w:p>
+    <w:p>
+      <w:pPr>
         <w:rPr>
           <w:rFonts w:ascii="Lucida Bright" w:hAnsi="Lucida Bright"/>
           <w:b/>
           <w:bCs/>
         </w:rPr>
       </w:pPr>
-    </w:p>
-    <w:p>
-      <w:pPr>
-        <w:spacing w:after="0"/>
+      <w:r>
         <w:rPr>
           <w:rFonts w:ascii="Lucida Bright" w:hAnsi="Lucida Bright"/>
           <w:b/>
           <w:bCs/>
         </w:rPr>
-      </w:pPr>
-    </w:p>
-    <w:p>
-      <w:pPr>
-        <w:rPr>
-          <w:rFonts w:ascii="Lucida Bright" w:hAnsi="Lucida Bright"/>
-          <w:b/>
-          <w:bCs/>
-        </w:rPr>
-      </w:pPr>
-      <w:r>
-        <w:rPr>
-          <w:rFonts w:ascii="Lucida Bright" w:hAnsi="Lucida Bright"/>
-          <w:b/>
-          <w:bCs/>
-        </w:rPr>
-        <w:br w:type="page"/>
-      </w:r>
-    </w:p>
-    <w:p>
-      <w:pPr>
-        <w:spacing w:after="0"/>
-        <w:rPr>
-          <w:rFonts w:ascii="Lucida Bright" w:hAnsi="Lucida Bright"/>
-          <w:b/>
-          <w:bCs/>
-        </w:rPr>
-      </w:pPr>
-      <w:r>
-        <w:rPr>
-          <w:rFonts w:ascii="Lucida Bright" w:hAnsi="Lucida Bright"/>
-          <w:b/>
-          <w:bCs/>
-        </w:rPr>
-        <w:lastRenderedPageBreak/>
         <w:t>MAIN – GAME LOOP, CONTROLLER, RENDERER, AND GAME</w:t>
       </w:r>
     </w:p>
     <w:p>
       <w:pPr>
-        <w:spacing w:after="0"/>
-        <w:rPr>
-          <w:rFonts w:ascii="Lucida Bright" w:hAnsi="Lucida Bright"/>
-        </w:rPr>
-      </w:pPr>
-    </w:p>
-    <w:p>
-      <w:pPr>
-        <w:spacing w:after="0"/>
+        <w:rPr>
+          <w:rFonts w:ascii="Lucida Bright" w:hAnsi="Lucida Bright"/>
+        </w:rPr>
+      </w:pPr>
+      <w:r>
+        <w:rPr>
+          <w:rFonts w:ascii="Lucida Bright" w:hAnsi="Lucida Bright"/>
+        </w:rPr>
+        <w:t>A game loop is implemented following the pattern: input-update-draw-render. The input and render steps are handled by the static classes Controller and Renderer, while the update and draw steps are handled by an instance of Game which contains logic for a simple menu as well as level data.</w:t>
+      </w:r>
+    </w:p>
+    <w:p>
+      <w:pPr>
         <w:rPr>
           <w:rFonts w:ascii="Lucida Bright" w:hAnsi="Lucida Bright"/>
         </w:rPr>
@@ -748,7 +1072,7 @@
                     </pic:cNvPicPr>
                   </pic:nvPicPr>
                   <pic:blipFill>
-                    <a:blip r:embed="rId6">
+                    <a:blip r:embed="rId8">
                       <a:extLst>
                         <a:ext uri="{28A0092B-C50C-407E-A947-70E740481C1C}">
                           <a14:useLocalDpi xmlns:a14="http://schemas.microsoft.com/office/drawing/2010/main" val="0"/>
@@ -782,29 +1106,6 @@
     </w:p>
     <w:p>
       <w:pPr>
-        <w:spacing w:after="0"/>
-        <w:rPr>
-          <w:rFonts w:ascii="Lucida Bright" w:hAnsi="Lucida Bright"/>
-        </w:rPr>
-      </w:pPr>
-      <w:r>
-        <w:rPr>
-          <w:rFonts w:ascii="Lucida Bright" w:hAnsi="Lucida Bright"/>
-        </w:rPr>
-        <w:t>A game loop is implemented following the pattern: input-update-draw-render. The input and render steps are handled by the static classes Controller and Renderer, while the update and draw steps are handled by an instance of Game which contains logic for a simple menu as well as level data.</w:t>
-      </w:r>
-    </w:p>
-    <w:p>
-      <w:pPr>
-        <w:spacing w:after="0"/>
-        <w:rPr>
-          <w:rFonts w:ascii="Lucida Bright" w:hAnsi="Lucida Bright"/>
-        </w:rPr>
-      </w:pPr>
-    </w:p>
-    <w:p>
-      <w:pPr>
-        <w:spacing w:after="0"/>
         <w:rPr>
           <w:rFonts w:ascii="Lucida Bright" w:hAnsi="Lucida Bright"/>
         </w:rPr>
@@ -860,15 +1161,6 @@
     </w:p>
     <w:p>
       <w:pPr>
-        <w:spacing w:after="0"/>
-        <w:rPr>
-          <w:rFonts w:ascii="Lucida Bright" w:hAnsi="Lucida Bright"/>
-        </w:rPr>
-      </w:pPr>
-    </w:p>
-    <w:p>
-      <w:pPr>
-        <w:spacing w:after="0"/>
         <w:rPr>
           <w:rFonts w:ascii="Lucida Bright" w:hAnsi="Lucida Bright"/>
         </w:rPr>
@@ -933,6 +1225,40 @@
         <w:rPr>
           <w:rFonts w:ascii="Lucida Bright" w:hAnsi="Lucida Bright"/>
         </w:rPr>
+        <w:t xml:space="preserve"> (</w:t>
+      </w:r>
+      <w:proofErr w:type="spellStart"/>
+      <w:r>
+        <w:rPr>
+          <w:rFonts w:ascii="Lucida Bright" w:hAnsi="Lucida Bright"/>
+        </w:rPr>
+        <w:t>ResourceManager</w:t>
+      </w:r>
+      <w:proofErr w:type="spellEnd"/>
+      <w:r>
+        <w:rPr>
+          <w:rFonts w:ascii="Lucida Bright" w:hAnsi="Lucida Bright"/>
+        </w:rPr>
+        <w:t xml:space="preserve"> also uses the </w:t>
+      </w:r>
+      <w:proofErr w:type="spellStart"/>
+      <w:r>
+        <w:rPr>
+          <w:rFonts w:ascii="Lucida Bright" w:hAnsi="Lucida Bright"/>
+        </w:rPr>
+        <w:t>ShaderHelper</w:t>
+      </w:r>
+      <w:proofErr w:type="spellEnd"/>
+      <w:r>
+        <w:rPr>
+          <w:rFonts w:ascii="Lucida Bright" w:hAnsi="Lucida Bright"/>
+        </w:rPr>
+        <w:t xml:space="preserve"> class)</w:t>
+      </w:r>
+      <w:r>
+        <w:rPr>
+          <w:rFonts w:ascii="Lucida Bright" w:hAnsi="Lucida Bright"/>
+        </w:rPr>
         <w:t xml:space="preserve">. Renderer’s drawing functions write to the frame buffer between frames and then the frame buffer is drawn to the </w:t>
       </w:r>
       <w:proofErr w:type="spellStart"/>
@@ -966,24 +1292,1273 @@
     </w:p>
     <w:p>
       <w:pPr>
-        <w:spacing w:after="0"/>
-        <w:rPr>
-          <w:rFonts w:ascii="Lucida Bright" w:hAnsi="Lucida Bright"/>
-        </w:rPr>
-      </w:pPr>
-    </w:p>
-    <w:p>
-      <w:pPr>
-        <w:spacing w:after="0"/>
-        <w:rPr>
-          <w:rFonts w:ascii="Lucida Bright" w:hAnsi="Lucida Bright"/>
-        </w:rPr>
-      </w:pPr>
-      <w:r>
-        <w:rPr>
-          <w:rFonts w:ascii="Lucida Bright" w:hAnsi="Lucida Bright"/>
-        </w:rPr>
-        <w:t>Game is responsible for wrapping an instance of Level and implementing a menu. It has two main functions.</w:t>
+        <w:rPr>
+          <w:rFonts w:ascii="Lucida Bright" w:hAnsi="Lucida Bright"/>
+        </w:rPr>
+      </w:pPr>
+    </w:p>
+    <w:p>
+      <w:pPr>
+        <w:rPr>
+          <w:rFonts w:ascii="Lucida Bright" w:hAnsi="Lucida Bright"/>
+          <w:b/>
+          <w:bCs/>
+        </w:rPr>
+      </w:pPr>
+      <w:r>
+        <w:rPr>
+          <w:rFonts w:ascii="Lucida Bright" w:hAnsi="Lucida Bright"/>
+          <w:b/>
+          <w:bCs/>
+        </w:rPr>
+        <w:t xml:space="preserve">GAME AND </w:t>
+      </w:r>
+      <w:r>
+        <w:rPr>
+          <w:rFonts w:ascii="Lucida Bright" w:hAnsi="Lucida Bright"/>
+          <w:b/>
+          <w:bCs/>
+        </w:rPr>
+        <w:t>SESSION</w:t>
+      </w:r>
+      <w:r>
+        <w:rPr>
+          <w:rFonts w:ascii="Lucida Bright" w:hAnsi="Lucida Bright"/>
+          <w:b/>
+          <w:bCs/>
+        </w:rPr>
+        <w:t xml:space="preserve"> – update and render</w:t>
+      </w:r>
+    </w:p>
+    <w:p>
+      <w:pPr>
+        <w:rPr>
+          <w:rFonts w:ascii="Lucida Bright" w:hAnsi="Lucida Bright"/>
+        </w:rPr>
+      </w:pPr>
+      <w:r>
+        <w:rPr>
+          <w:rFonts w:ascii="Lucida Bright" w:hAnsi="Lucida Bright"/>
+        </w:rPr>
+        <w:t>Game is responsible for wrapping an instance of Session, which controls the game/simulation/level data, and implementing a basic menu (starting the game, quitting, pausing, and restarting).</w:t>
+      </w:r>
+      <w:r>
+        <w:rPr>
+          <w:rFonts w:ascii="Lucida Bright" w:hAnsi="Lucida Bright"/>
+        </w:rPr>
+        <w:t xml:space="preserve"> </w:t>
+      </w:r>
+    </w:p>
+    <w:p>
+      <w:pPr>
+        <w:rPr>
+          <w:rFonts w:ascii="Lucida Bright" w:hAnsi="Lucida Bright"/>
+        </w:rPr>
+      </w:pPr>
+      <w:r>
+        <w:rPr>
+          <w:rFonts w:ascii="Lucida Bright" w:hAnsi="Lucida Bright"/>
+          <w:noProof/>
+        </w:rPr>
+        <w:drawing>
+          <wp:anchor distT="0" distB="0" distL="114300" distR="114300" simplePos="0" relativeHeight="251659264" behindDoc="0" locked="0" layoutInCell="1" allowOverlap="1" wp14:anchorId="1D4A7BE5" wp14:editId="32FF521F">
+            <wp:simplePos x="0" y="0"/>
+            <wp:positionH relativeFrom="margin">
+              <wp:align>right</wp:align>
+            </wp:positionH>
+            <wp:positionV relativeFrom="paragraph">
+              <wp:posOffset>56294</wp:posOffset>
+            </wp:positionV>
+            <wp:extent cx="3124835" cy="1693545"/>
+            <wp:effectExtent l="0" t="0" r="0" b="1905"/>
+            <wp:wrapSquare wrapText="bothSides"/>
+            <wp:docPr id="1028527690" name="Picture 8"/>
+            <wp:cNvGraphicFramePr>
+              <a:graphicFrameLocks xmlns:a="http://schemas.openxmlformats.org/drawingml/2006/main" noChangeAspect="1"/>
+            </wp:cNvGraphicFramePr>
+            <a:graphic xmlns:a="http://schemas.openxmlformats.org/drawingml/2006/main">
+              <a:graphicData uri="http://schemas.openxmlformats.org/drawingml/2006/picture">
+                <pic:pic xmlns:pic="http://schemas.openxmlformats.org/drawingml/2006/picture">
+                  <pic:nvPicPr>
+                    <pic:cNvPr id="0" name="Picture 8"/>
+                    <pic:cNvPicPr>
+                      <a:picLocks noChangeAspect="1" noChangeArrowheads="1"/>
+                    </pic:cNvPicPr>
+                  </pic:nvPicPr>
+                  <pic:blipFill>
+                    <a:blip r:embed="rId9">
+                      <a:extLst>
+                        <a:ext uri="{28A0092B-C50C-407E-A947-70E740481C1C}">
+                          <a14:useLocalDpi xmlns:a14="http://schemas.microsoft.com/office/drawing/2010/main" val="0"/>
+                        </a:ext>
+                      </a:extLst>
+                    </a:blip>
+                    <a:srcRect/>
+                    <a:stretch>
+                      <a:fillRect/>
+                    </a:stretch>
+                  </pic:blipFill>
+                  <pic:spPr bwMode="auto">
+                    <a:xfrm>
+                      <a:off x="0" y="0"/>
+                      <a:ext cx="3124835" cy="1693545"/>
+                    </a:xfrm>
+                    <a:prstGeom prst="rect">
+                      <a:avLst/>
+                    </a:prstGeom>
+                    <a:noFill/>
+                    <a:ln>
+                      <a:noFill/>
+                    </a:ln>
+                  </pic:spPr>
+                </pic:pic>
+              </a:graphicData>
+            </a:graphic>
+          </wp:anchor>
+        </w:drawing>
+      </w:r>
+      <w:r>
+        <w:rPr>
+          <w:rFonts w:ascii="Lucida Bright" w:hAnsi="Lucida Bright"/>
+        </w:rPr>
+        <w:t xml:space="preserve">When you run main.py and press RETURN, </w:t>
+      </w:r>
+      <w:r>
+        <w:rPr>
+          <w:rFonts w:ascii="Lucida Bright" w:hAnsi="Lucida Bright"/>
+        </w:rPr>
+        <w:t>a</w:t>
+      </w:r>
+      <w:r>
+        <w:rPr>
+          <w:rFonts w:ascii="Lucida Bright" w:hAnsi="Lucida Bright"/>
+        </w:rPr>
+        <w:t xml:space="preserve"> Session object is instantiated in Game with a </w:t>
+      </w:r>
+      <w:proofErr w:type="spellStart"/>
+      <w:r>
+        <w:rPr>
+          <w:rFonts w:ascii="Lucida Bright" w:hAnsi="Lucida Bright"/>
+        </w:rPr>
+        <w:t>LevelFile</w:t>
+      </w:r>
+      <w:proofErr w:type="spellEnd"/>
+      <w:r>
+        <w:rPr>
+          <w:rFonts w:ascii="Lucida Bright" w:hAnsi="Lucida Bright"/>
+        </w:rPr>
+        <w:t xml:space="preserve">. A </w:t>
+      </w:r>
+      <w:proofErr w:type="spellStart"/>
+      <w:r>
+        <w:rPr>
+          <w:rFonts w:ascii="Lucida Bright" w:hAnsi="Lucida Bright"/>
+        </w:rPr>
+        <w:t>LevelFile</w:t>
+      </w:r>
+      <w:proofErr w:type="spellEnd"/>
+      <w:r>
+        <w:rPr>
+          <w:rFonts w:ascii="Lucida Bright" w:hAnsi="Lucida Bright"/>
+        </w:rPr>
+        <w:t xml:space="preserve"> </w:t>
+      </w:r>
+      <w:r>
+        <w:rPr>
+          <w:rFonts w:ascii="Lucida Bright" w:hAnsi="Lucida Bright"/>
+        </w:rPr>
+        <w:t>is a class stored in assets/levels with three static references</w:t>
+      </w:r>
+      <w:r>
+        <w:rPr>
+          <w:rFonts w:ascii="Lucida Bright" w:hAnsi="Lucida Bright"/>
+        </w:rPr>
+        <w:t xml:space="preserve"> (Builder, </w:t>
+      </w:r>
+      <w:proofErr w:type="spellStart"/>
+      <w:r>
+        <w:rPr>
+          <w:rFonts w:ascii="Lucida Bright" w:hAnsi="Lucida Bright"/>
+        </w:rPr>
+        <w:t>MainScript</w:t>
+      </w:r>
+      <w:proofErr w:type="spellEnd"/>
+      <w:r>
+        <w:rPr>
+          <w:rFonts w:ascii="Lucida Bright" w:hAnsi="Lucida Bright"/>
+        </w:rPr>
+        <w:t xml:space="preserve">, </w:t>
+      </w:r>
+      <w:r>
+        <w:rPr>
+          <w:rFonts w:ascii="Lucida Bright" w:hAnsi="Lucida Bright"/>
+        </w:rPr>
+        <w:t>Canvas</w:t>
+      </w:r>
+      <w:r>
+        <w:rPr>
+          <w:rFonts w:ascii="Lucida Bright" w:hAnsi="Lucida Bright"/>
+        </w:rPr>
+        <w:t>) which are passed to Session.</w:t>
+      </w:r>
+      <w:r>
+        <w:rPr>
+          <w:rFonts w:ascii="Lucida Bright" w:hAnsi="Lucida Bright"/>
+        </w:rPr>
+        <w:t xml:space="preserve"> Session creates an Index and populates it using the </w:t>
+      </w:r>
+      <w:proofErr w:type="spellStart"/>
+      <w:proofErr w:type="gramStart"/>
+      <w:r>
+        <w:rPr>
+          <w:rFonts w:ascii="Lucida Bright" w:hAnsi="Lucida Bright"/>
+        </w:rPr>
+        <w:t>builder.build</w:t>
+      </w:r>
+      <w:proofErr w:type="spellEnd"/>
+      <w:proofErr w:type="gramEnd"/>
+      <w:r>
+        <w:rPr>
+          <w:rFonts w:ascii="Lucida Bright" w:hAnsi="Lucida Bright"/>
+        </w:rPr>
+        <w:t>() method.</w:t>
+      </w:r>
+    </w:p>
+    <w:p>
+      <w:pPr>
+        <w:rPr>
+          <w:rFonts w:ascii="Lucida Bright" w:hAnsi="Lucida Bright"/>
+        </w:rPr>
+      </w:pPr>
+      <w:r>
+        <w:rPr>
+          <w:rFonts w:ascii="Lucida Bright" w:hAnsi="Lucida Bright"/>
+        </w:rPr>
+        <w:t xml:space="preserve">It also creates an empty Index to contain </w:t>
+      </w:r>
+      <w:proofErr w:type="gramStart"/>
+      <w:r>
+        <w:rPr>
+          <w:rFonts w:ascii="Lucida Bright" w:hAnsi="Lucida Bright"/>
+        </w:rPr>
+        <w:t xml:space="preserve">all </w:t>
+      </w:r>
+      <w:r>
+        <w:rPr>
+          <w:rFonts w:ascii="Lucida Bright" w:hAnsi="Lucida Bright"/>
+        </w:rPr>
+        <w:t>of</w:t>
+      </w:r>
+      <w:proofErr w:type="gramEnd"/>
+      <w:r>
+        <w:rPr>
+          <w:rFonts w:ascii="Lucida Bright" w:hAnsi="Lucida Bright"/>
+        </w:rPr>
+        <w:t xml:space="preserve"> </w:t>
+      </w:r>
+      <w:r>
+        <w:rPr>
+          <w:rFonts w:ascii="Lucida Bright" w:hAnsi="Lucida Bright"/>
+        </w:rPr>
+        <w:t>the game data</w:t>
+      </w:r>
+      <w:r>
+        <w:rPr>
+          <w:rFonts w:ascii="Lucida Bright" w:hAnsi="Lucida Bright"/>
+        </w:rPr>
+        <w:t>,</w:t>
+      </w:r>
+      <w:r>
+        <w:rPr>
+          <w:rFonts w:ascii="Lucida Bright" w:hAnsi="Lucida Bright"/>
+        </w:rPr>
+        <w:t xml:space="preserve"> which </w:t>
+      </w:r>
+      <w:r>
+        <w:rPr>
+          <w:rFonts w:ascii="Lucida Bright" w:hAnsi="Lucida Bright"/>
+        </w:rPr>
+        <w:t>is</w:t>
+      </w:r>
+      <w:r>
+        <w:rPr>
+          <w:rFonts w:ascii="Lucida Bright" w:hAnsi="Lucida Bright"/>
+        </w:rPr>
+        <w:t xml:space="preserve"> organized as </w:t>
+      </w:r>
+      <w:r>
+        <w:rPr>
+          <w:rFonts w:ascii="Lucida Bright" w:hAnsi="Lucida Bright"/>
+        </w:rPr>
+        <w:t>objects</w:t>
+      </w:r>
+      <w:r>
+        <w:rPr>
+          <w:rFonts w:ascii="Lucida Bright" w:hAnsi="Lucida Bright"/>
+        </w:rPr>
+        <w:t xml:space="preserve">: a collection of properties </w:t>
+      </w:r>
+      <w:r>
+        <w:rPr>
+          <w:rFonts w:ascii="Lucida Bright" w:hAnsi="Lucida Bright"/>
+        </w:rPr>
+        <w:t xml:space="preserve">(called props) </w:t>
+      </w:r>
+      <w:r>
+        <w:rPr>
+          <w:rFonts w:ascii="Lucida Bright" w:hAnsi="Lucida Bright"/>
+        </w:rPr>
+        <w:t xml:space="preserve">with a shared key. There are two main ways to access </w:t>
+      </w:r>
+      <w:proofErr w:type="spellStart"/>
+      <w:r>
+        <w:rPr>
+          <w:rFonts w:ascii="Lucida Bright" w:hAnsi="Lucida Bright"/>
+        </w:rPr>
+        <w:t>objs</w:t>
+      </w:r>
+      <w:proofErr w:type="spellEnd"/>
+      <w:r>
+        <w:rPr>
+          <w:rFonts w:ascii="Lucida Bright" w:hAnsi="Lucida Bright"/>
+        </w:rPr>
+        <w:t xml:space="preserve"> within the index. </w:t>
+      </w:r>
+    </w:p>
+    <w:p>
+      <w:pPr>
+        <w:pStyle w:val="ListParagraph"/>
+        <w:numPr>
+          <w:ilvl w:val="0"/>
+          <w:numId w:val="7"/>
+        </w:numPr>
+        <w:rPr>
+          <w:rFonts w:ascii="Lucida Bright" w:hAnsi="Lucida Bright"/>
+        </w:rPr>
+      </w:pPr>
+      <w:proofErr w:type="spellStart"/>
+      <w:r>
+        <w:rPr>
+          <w:rFonts w:ascii="Lucida Bright" w:hAnsi="Lucida Bright"/>
+        </w:rPr>
+        <w:t>Index.get</w:t>
+      </w:r>
+      <w:proofErr w:type="spellEnd"/>
+      <w:r>
+        <w:rPr>
+          <w:rFonts w:ascii="Lucida Bright" w:hAnsi="Lucida Bright"/>
+        </w:rPr>
+        <w:t xml:space="preserve">(key) returns </w:t>
+      </w:r>
+      <w:r>
+        <w:rPr>
+          <w:rFonts w:ascii="Lucida Bright" w:hAnsi="Lucida Bright"/>
+        </w:rPr>
+        <w:t xml:space="preserve">an Obj </w:t>
+      </w:r>
+      <w:r>
+        <w:rPr>
+          <w:rFonts w:ascii="Lucida Bright" w:hAnsi="Lucida Bright"/>
+        </w:rPr>
+        <w:t xml:space="preserve">object </w:t>
+      </w:r>
+      <w:r>
+        <w:rPr>
+          <w:rFonts w:ascii="Lucida Bright" w:hAnsi="Lucida Bright"/>
+        </w:rPr>
+        <w:t xml:space="preserve">with that key and </w:t>
+      </w:r>
+      <w:r>
+        <w:rPr>
+          <w:rFonts w:ascii="Lucida Bright" w:hAnsi="Lucida Bright"/>
+        </w:rPr>
+        <w:t xml:space="preserve">all </w:t>
+      </w:r>
+      <w:r>
+        <w:rPr>
+          <w:rFonts w:ascii="Lucida Bright" w:hAnsi="Lucida Bright"/>
+        </w:rPr>
+        <w:t>props</w:t>
+      </w:r>
+      <w:r>
+        <w:rPr>
+          <w:rFonts w:ascii="Lucida Bright" w:hAnsi="Lucida Bright"/>
+        </w:rPr>
+        <w:t xml:space="preserve"> associated with </w:t>
+      </w:r>
+      <w:r>
+        <w:rPr>
+          <w:rFonts w:ascii="Lucida Bright" w:hAnsi="Lucida Bright"/>
+        </w:rPr>
+        <w:t>it</w:t>
+      </w:r>
+      <w:r>
+        <w:rPr>
+          <w:rFonts w:ascii="Lucida Bright" w:hAnsi="Lucida Bright"/>
+        </w:rPr>
+        <w:t xml:space="preserve">. </w:t>
+      </w:r>
+    </w:p>
+    <w:p>
+      <w:pPr>
+        <w:pStyle w:val="ListParagraph"/>
+        <w:numPr>
+          <w:ilvl w:val="0"/>
+          <w:numId w:val="7"/>
+        </w:numPr>
+        <w:rPr>
+          <w:rFonts w:ascii="Lucida Bright" w:hAnsi="Lucida Bright"/>
+        </w:rPr>
+      </w:pPr>
+      <w:r>
+        <w:rPr>
+          <w:rFonts w:ascii="Lucida Bright" w:hAnsi="Lucida Bright"/>
+        </w:rPr>
+        <w:t xml:space="preserve">Index[type] returns </w:t>
+      </w:r>
+      <w:r>
+        <w:rPr>
+          <w:rFonts w:ascii="Lucida Bright" w:hAnsi="Lucida Bright"/>
+        </w:rPr>
+        <w:t>a list of all</w:t>
+      </w:r>
+      <w:r>
+        <w:rPr>
+          <w:rFonts w:ascii="Lucida Bright" w:hAnsi="Lucida Bright"/>
+        </w:rPr>
+        <w:t xml:space="preserve"> prop</w:t>
+      </w:r>
+      <w:r>
+        <w:rPr>
+          <w:rFonts w:ascii="Lucida Bright" w:hAnsi="Lucida Bright"/>
+        </w:rPr>
+        <w:t>s</w:t>
+      </w:r>
+      <w:r>
+        <w:rPr>
+          <w:rFonts w:ascii="Lucida Bright" w:hAnsi="Lucida Bright"/>
+        </w:rPr>
+        <w:t xml:space="preserve"> of the given type. </w:t>
+      </w:r>
+    </w:p>
+    <w:p>
+      <w:pPr>
+        <w:pStyle w:val="ListParagraph"/>
+        <w:numPr>
+          <w:ilvl w:val="0"/>
+          <w:numId w:val="7"/>
+        </w:numPr>
+        <w:rPr>
+          <w:rFonts w:ascii="Lucida Bright" w:hAnsi="Lucida Bright"/>
+        </w:rPr>
+      </w:pPr>
+      <w:proofErr w:type="gramStart"/>
+      <w:r>
+        <w:rPr>
+          <w:rFonts w:ascii="Lucida Bright" w:hAnsi="Lucida Bright"/>
+        </w:rPr>
+        <w:t>Index[</w:t>
+      </w:r>
+      <w:proofErr w:type="gramEnd"/>
+      <w:r>
+        <w:rPr>
+          <w:rFonts w:ascii="Lucida Bright" w:hAnsi="Lucida Bright"/>
+        </w:rPr>
+        <w:t xml:space="preserve">type1, type2, </w:t>
+      </w:r>
+      <w:r>
+        <w:rPr>
+          <w:rFonts w:ascii="Lucida Bright" w:hAnsi="Lucida Bright"/>
+        </w:rPr>
+        <w:t>etc.</w:t>
+      </w:r>
+      <w:r>
+        <w:rPr>
+          <w:rFonts w:ascii="Lucida Bright" w:hAnsi="Lucida Bright"/>
+        </w:rPr>
+        <w:t xml:space="preserve">] returns </w:t>
+      </w:r>
+      <w:r>
+        <w:rPr>
+          <w:rFonts w:ascii="Lucida Bright" w:hAnsi="Lucida Bright"/>
+        </w:rPr>
+        <w:t xml:space="preserve">a list of “partial objects”: tuples of </w:t>
+      </w:r>
+      <w:r>
+        <w:rPr>
+          <w:rFonts w:ascii="Lucida Bright" w:hAnsi="Lucida Bright"/>
+        </w:rPr>
+        <w:t xml:space="preserve">key-matched props of </w:t>
+      </w:r>
+      <w:r>
+        <w:rPr>
+          <w:rFonts w:ascii="Lucida Bright" w:hAnsi="Lucida Bright"/>
+        </w:rPr>
+        <w:t xml:space="preserve">type1, type2, </w:t>
+      </w:r>
+      <w:proofErr w:type="gramStart"/>
+      <w:r>
+        <w:rPr>
+          <w:rFonts w:ascii="Lucida Bright" w:hAnsi="Lucida Bright"/>
+        </w:rPr>
+        <w:t>etc..</w:t>
+      </w:r>
+      <w:proofErr w:type="gramEnd"/>
+      <w:r>
+        <w:rPr>
+          <w:rFonts w:ascii="Lucida Bright" w:hAnsi="Lucida Bright"/>
+        </w:rPr>
+        <w:t xml:space="preserve"> This function implements a dependency requirement by which all objects with a prop of type1 must have a prop of type2, type3, </w:t>
+      </w:r>
+      <w:proofErr w:type="gramStart"/>
+      <w:r>
+        <w:rPr>
+          <w:rFonts w:ascii="Lucida Bright" w:hAnsi="Lucida Bright"/>
+        </w:rPr>
+        <w:t>etc..</w:t>
+      </w:r>
+      <w:proofErr w:type="gramEnd"/>
+    </w:p>
+    <w:p>
+      <w:pPr>
+        <w:pStyle w:val="ListParagraph"/>
+        <w:numPr>
+          <w:ilvl w:val="0"/>
+          <w:numId w:val="7"/>
+        </w:numPr>
+        <w:rPr>
+          <w:rFonts w:ascii="Lucida Bright" w:hAnsi="Lucida Bright"/>
+        </w:rPr>
+      </w:pPr>
+      <w:proofErr w:type="spellStart"/>
+      <w:r>
+        <w:rPr>
+          <w:rFonts w:ascii="Lucida Bright" w:hAnsi="Lucida Bright"/>
+        </w:rPr>
+        <w:t>Index.match</w:t>
+      </w:r>
+      <w:proofErr w:type="spellEnd"/>
+      <w:r>
+        <w:rPr>
+          <w:rFonts w:ascii="Lucida Bright" w:hAnsi="Lucida Bright"/>
+        </w:rPr>
+        <w:t>(</w:t>
+      </w:r>
+      <w:r>
+        <w:rPr>
+          <w:rFonts w:ascii="Lucida Bright" w:hAnsi="Lucida Bright"/>
+        </w:rPr>
+        <w:t>type1, type2, …</w:t>
+      </w:r>
+      <w:r>
+        <w:rPr>
+          <w:rFonts w:ascii="Lucida Bright" w:hAnsi="Lucida Bright"/>
+        </w:rPr>
+        <w:t xml:space="preserve">) returns </w:t>
+      </w:r>
+      <w:r>
+        <w:rPr>
+          <w:rFonts w:ascii="Lucida Bright" w:hAnsi="Lucida Bright"/>
+        </w:rPr>
+        <w:t>a list of tuples of props with all given types, with no dependency requirement.</w:t>
+      </w:r>
+    </w:p>
+    <w:p>
+      <w:pPr>
+        <w:rPr>
+          <w:rFonts w:ascii="Lucida Bright" w:hAnsi="Lucida Bright"/>
+        </w:rPr>
+      </w:pPr>
+      <w:r>
+        <w:rPr>
+          <w:rFonts w:ascii="Lucida Bright" w:hAnsi="Lucida Bright"/>
+        </w:rPr>
+        <w:t>The session begins to update immediately</w:t>
+      </w:r>
+      <w:r>
+        <w:rPr>
+          <w:rFonts w:ascii="Lucida Bright" w:hAnsi="Lucida Bright"/>
+        </w:rPr>
+        <w:t xml:space="preserve"> unless ESCAPE is pressed to “pause” Game. When Game is “paused” the session is drawn with a filter. In the update function of session, there is a second “pause” </w:t>
+      </w:r>
+      <w:r>
+        <w:rPr>
+          <w:rFonts w:ascii="Lucida Bright" w:hAnsi="Lucida Bright"/>
+        </w:rPr>
+        <w:t xml:space="preserve">activated by pressing F </w:t>
+      </w:r>
+      <w:r>
+        <w:rPr>
+          <w:rFonts w:ascii="Lucida Bright" w:hAnsi="Lucida Bright"/>
+        </w:rPr>
+        <w:t>which simply freezes the game with no filter and allows you to press L to see one frame run.</w:t>
+      </w:r>
+    </w:p>
+    <w:p>
+      <w:pPr>
+        <w:rPr>
+          <w:rFonts w:ascii="Lucida Bright" w:hAnsi="Lucida Bright"/>
+        </w:rPr>
+      </w:pPr>
+      <w:r>
+        <w:rPr>
+          <w:rFonts w:ascii="Lucida Bright" w:hAnsi="Lucida Bright"/>
+        </w:rPr>
+        <w:t xml:space="preserve">Session update then calls the </w:t>
+      </w:r>
+      <w:proofErr w:type="spellStart"/>
+      <w:r>
+        <w:rPr>
+          <w:rFonts w:ascii="Lucida Bright" w:hAnsi="Lucida Bright"/>
+        </w:rPr>
+        <w:t>MainScript</w:t>
+      </w:r>
+      <w:proofErr w:type="spellEnd"/>
+      <w:r>
+        <w:rPr>
+          <w:rFonts w:ascii="Lucida Bright" w:hAnsi="Lucida Bright"/>
+        </w:rPr>
+        <w:t xml:space="preserve"> set by the </w:t>
+      </w:r>
+      <w:proofErr w:type="spellStart"/>
+      <w:r>
+        <w:rPr>
+          <w:rFonts w:ascii="Lucida Bright" w:hAnsi="Lucida Bright"/>
+        </w:rPr>
+        <w:t>LevelFile</w:t>
+      </w:r>
+      <w:proofErr w:type="spellEnd"/>
+      <w:r>
+        <w:rPr>
+          <w:rFonts w:ascii="Lucida Bright" w:hAnsi="Lucida Bright"/>
+        </w:rPr>
+        <w:t xml:space="preserve"> and then proceeds to run the </w:t>
+      </w:r>
+      <w:proofErr w:type="spellStart"/>
+      <w:r>
+        <w:rPr>
+          <w:rFonts w:ascii="Lucida Bright" w:hAnsi="Lucida Bright"/>
+        </w:rPr>
+        <w:t>MasterScript</w:t>
+      </w:r>
+      <w:proofErr w:type="spellEnd"/>
+      <w:r>
+        <w:rPr>
+          <w:rFonts w:ascii="Lucida Bright" w:hAnsi="Lucida Bright"/>
+        </w:rPr>
+        <w:t>:</w:t>
+      </w:r>
+    </w:p>
+    <w:p>
+      <w:pPr>
+        <w:rPr>
+          <w:rFonts w:ascii="Lucida Bright" w:hAnsi="Lucida Bright"/>
+        </w:rPr>
+      </w:pPr>
+      <w:r>
+        <w:rPr>
+          <w:rFonts w:ascii="Lucida Bright" w:hAnsi="Lucida Bright"/>
+          <w:noProof/>
+        </w:rPr>
+        <w:drawing>
+          <wp:inline distT="0" distB="0" distL="0" distR="0" wp14:anchorId="016C573D" wp14:editId="08E55768">
+            <wp:extent cx="3021330" cy="501015"/>
+            <wp:effectExtent l="0" t="0" r="7620" b="0"/>
+            <wp:docPr id="1149596367" name="Picture 9"/>
+            <wp:cNvGraphicFramePr>
+              <a:graphicFrameLocks xmlns:a="http://schemas.openxmlformats.org/drawingml/2006/main" noChangeAspect="1"/>
+            </wp:cNvGraphicFramePr>
+            <a:graphic xmlns:a="http://schemas.openxmlformats.org/drawingml/2006/main">
+              <a:graphicData uri="http://schemas.openxmlformats.org/drawingml/2006/picture">
+                <pic:pic xmlns:pic="http://schemas.openxmlformats.org/drawingml/2006/picture">
+                  <pic:nvPicPr>
+                    <pic:cNvPr id="0" name="Picture 9"/>
+                    <pic:cNvPicPr>
+                      <a:picLocks noChangeAspect="1" noChangeArrowheads="1"/>
+                    </pic:cNvPicPr>
+                  </pic:nvPicPr>
+                  <pic:blipFill>
+                    <a:blip r:embed="rId10">
+                      <a:extLst>
+                        <a:ext uri="{28A0092B-C50C-407E-A947-70E740481C1C}">
+                          <a14:useLocalDpi xmlns:a14="http://schemas.microsoft.com/office/drawing/2010/main" val="0"/>
+                        </a:ext>
+                      </a:extLst>
+                    </a:blip>
+                    <a:srcRect/>
+                    <a:stretch>
+                      <a:fillRect/>
+                    </a:stretch>
+                  </pic:blipFill>
+                  <pic:spPr bwMode="auto">
+                    <a:xfrm>
+                      <a:off x="0" y="0"/>
+                      <a:ext cx="3021330" cy="501015"/>
+                    </a:xfrm>
+                    <a:prstGeom prst="rect">
+                      <a:avLst/>
+                    </a:prstGeom>
+                    <a:noFill/>
+                    <a:ln>
+                      <a:noFill/>
+                    </a:ln>
+                  </pic:spPr>
+                </pic:pic>
+              </a:graphicData>
+            </a:graphic>
+          </wp:inline>
+        </w:drawing>
+      </w:r>
+    </w:p>
+    <w:p>
+      <w:pPr>
+        <w:rPr>
+          <w:rFonts w:ascii="Lucida Bright" w:hAnsi="Lucida Bright"/>
+        </w:rPr>
+      </w:pPr>
+      <w:r>
+        <w:rPr>
+          <w:rFonts w:ascii="Lucida Bright" w:hAnsi="Lucida Bright"/>
+        </w:rPr>
+        <w:t xml:space="preserve">A </w:t>
+      </w:r>
+      <w:proofErr w:type="spellStart"/>
+      <w:r>
+        <w:rPr>
+          <w:rFonts w:ascii="Lucida Bright" w:hAnsi="Lucida Bright"/>
+        </w:rPr>
+        <w:t>MainScript</w:t>
+      </w:r>
+      <w:proofErr w:type="spellEnd"/>
+      <w:r>
+        <w:rPr>
+          <w:rFonts w:ascii="Lucida Bright" w:hAnsi="Lucida Bright"/>
+        </w:rPr>
+        <w:t xml:space="preserve"> controls the game first </w:t>
+      </w:r>
+      <w:r>
+        <w:rPr>
+          <w:rFonts w:ascii="Lucida Bright" w:hAnsi="Lucida Bright"/>
+        </w:rPr>
+        <w:t>to</w:t>
+      </w:r>
+      <w:r>
+        <w:rPr>
+          <w:rFonts w:ascii="Lucida Bright" w:hAnsi="Lucida Bright"/>
+        </w:rPr>
+        <w:t xml:space="preserve"> implement user input and any other high-level logic needed to run the game including changing levels, i.e., changing the builder, </w:t>
+      </w:r>
+      <w:proofErr w:type="spellStart"/>
+      <w:r>
+        <w:rPr>
+          <w:rFonts w:ascii="Lucida Bright" w:hAnsi="Lucida Bright"/>
+        </w:rPr>
+        <w:t>mainScript</w:t>
+      </w:r>
+      <w:proofErr w:type="spellEnd"/>
+      <w:r>
+        <w:rPr>
+          <w:rFonts w:ascii="Lucida Bright" w:hAnsi="Lucida Bright"/>
+        </w:rPr>
+        <w:t>, and canvas of the session.</w:t>
+      </w:r>
+    </w:p>
+    <w:p>
+      <w:pPr>
+        <w:rPr>
+          <w:rFonts w:ascii="Lucida Bright" w:hAnsi="Lucida Bright"/>
+        </w:rPr>
+      </w:pPr>
+      <w:proofErr w:type="spellStart"/>
+      <w:r>
+        <w:rPr>
+          <w:rFonts w:ascii="Lucida Bright" w:hAnsi="Lucida Bright"/>
+        </w:rPr>
+        <w:t>MasterScript</w:t>
+      </w:r>
+      <w:proofErr w:type="spellEnd"/>
+      <w:r>
+        <w:rPr>
+          <w:rFonts w:ascii="Lucida Bright" w:hAnsi="Lucida Bright"/>
+        </w:rPr>
+        <w:t xml:space="preserve"> is the </w:t>
+      </w:r>
+      <w:r>
+        <w:rPr>
+          <w:rFonts w:ascii="Lucida Bright" w:hAnsi="Lucida Bright"/>
+          <w:i/>
+          <w:iCs/>
+        </w:rPr>
+        <w:t>meat and potatoes</w:t>
+      </w:r>
+      <w:r>
+        <w:rPr>
+          <w:rFonts w:ascii="Lucida Bright" w:hAnsi="Lucida Bright"/>
+        </w:rPr>
+        <w:t xml:space="preserve"> of the engine including ten discrete steps:</w:t>
+      </w:r>
+    </w:p>
+    <w:p>
+      <w:pPr>
+        <w:rPr>
+          <w:rFonts w:ascii="Lucida Bright" w:hAnsi="Lucida Bright"/>
+        </w:rPr>
+      </w:pPr>
+      <w:r>
+        <w:rPr>
+          <w:rFonts w:ascii="Lucida Bright" w:hAnsi="Lucida Bright"/>
+          <w:noProof/>
+        </w:rPr>
+        <w:drawing>
+          <wp:inline distT="0" distB="0" distL="0" distR="0" wp14:anchorId="51F24AEB" wp14:editId="21A116AE">
+            <wp:extent cx="5937885" cy="3467735"/>
+            <wp:effectExtent l="0" t="0" r="5715" b="0"/>
+            <wp:docPr id="1513949074" name="Picture 12"/>
+            <wp:cNvGraphicFramePr>
+              <a:graphicFrameLocks xmlns:a="http://schemas.openxmlformats.org/drawingml/2006/main" noChangeAspect="1"/>
+            </wp:cNvGraphicFramePr>
+            <a:graphic xmlns:a="http://schemas.openxmlformats.org/drawingml/2006/main">
+              <a:graphicData uri="http://schemas.openxmlformats.org/drawingml/2006/picture">
+                <pic:pic xmlns:pic="http://schemas.openxmlformats.org/drawingml/2006/picture">
+                  <pic:nvPicPr>
+                    <pic:cNvPr id="0" name="Picture 12"/>
+                    <pic:cNvPicPr>
+                      <a:picLocks noChangeAspect="1" noChangeArrowheads="1"/>
+                    </pic:cNvPicPr>
+                  </pic:nvPicPr>
+                  <pic:blipFill>
+                    <a:blip r:embed="rId11">
+                      <a:extLst>
+                        <a:ext uri="{28A0092B-C50C-407E-A947-70E740481C1C}">
+                          <a14:useLocalDpi xmlns:a14="http://schemas.microsoft.com/office/drawing/2010/main" val="0"/>
+                        </a:ext>
+                      </a:extLst>
+                    </a:blip>
+                    <a:srcRect/>
+                    <a:stretch>
+                      <a:fillRect/>
+                    </a:stretch>
+                  </pic:blipFill>
+                  <pic:spPr bwMode="auto">
+                    <a:xfrm>
+                      <a:off x="0" y="0"/>
+                      <a:ext cx="5937885" cy="3467735"/>
+                    </a:xfrm>
+                    <a:prstGeom prst="rect">
+                      <a:avLst/>
+                    </a:prstGeom>
+                    <a:noFill/>
+                    <a:ln>
+                      <a:noFill/>
+                    </a:ln>
+                  </pic:spPr>
+                </pic:pic>
+              </a:graphicData>
+            </a:graphic>
+          </wp:inline>
+        </w:drawing>
+      </w:r>
+    </w:p>
+    <w:p>
+      <w:pPr>
+        <w:pStyle w:val="ListParagraph"/>
+        <w:numPr>
+          <w:ilvl w:val="0"/>
+          <w:numId w:val="8"/>
+        </w:numPr>
+        <w:rPr>
+          <w:rFonts w:ascii="Lucida Bright" w:hAnsi="Lucida Bright"/>
+        </w:rPr>
+      </w:pPr>
+      <w:r>
+        <w:rPr>
+          <w:rFonts w:ascii="Lucida Bright" w:hAnsi="Lucida Bright"/>
+        </w:rPr>
+        <w:t>Update Timers in the index</w:t>
+      </w:r>
+      <w:r>
+        <w:rPr>
+          <w:rFonts w:ascii="Lucida Bright" w:hAnsi="Lucida Bright"/>
+        </w:rPr>
+        <w:t>.</w:t>
+      </w:r>
+    </w:p>
+    <w:p>
+      <w:pPr>
+        <w:pStyle w:val="ListParagraph"/>
+        <w:numPr>
+          <w:ilvl w:val="0"/>
+          <w:numId w:val="8"/>
+        </w:numPr>
+        <w:rPr>
+          <w:rFonts w:ascii="Lucida Bright" w:hAnsi="Lucida Bright"/>
+        </w:rPr>
+      </w:pPr>
+      <w:r>
+        <w:rPr>
+          <w:rFonts w:ascii="Lucida Bright" w:hAnsi="Lucida Bright"/>
+        </w:rPr>
+        <w:t>*</w:t>
+      </w:r>
+      <w:r>
+        <w:rPr>
+          <w:rFonts w:ascii="Lucida Bright" w:hAnsi="Lucida Bright"/>
+        </w:rPr>
+        <w:t xml:space="preserve">Execute </w:t>
+      </w:r>
+      <w:proofErr w:type="spellStart"/>
+      <w:r>
+        <w:rPr>
+          <w:rFonts w:ascii="Lucida Bright" w:hAnsi="Lucida Bright"/>
+        </w:rPr>
+        <w:t>PreScripts</w:t>
+      </w:r>
+      <w:proofErr w:type="spellEnd"/>
+      <w:r>
+        <w:rPr>
+          <w:rFonts w:ascii="Lucida Bright" w:hAnsi="Lucida Bright"/>
+        </w:rPr>
+        <w:t xml:space="preserve"> in the index</w:t>
+      </w:r>
+      <w:r>
+        <w:rPr>
+          <w:rFonts w:ascii="Lucida Bright" w:hAnsi="Lucida Bright"/>
+        </w:rPr>
+        <w:t>.</w:t>
+      </w:r>
+    </w:p>
+    <w:p>
+      <w:pPr>
+        <w:pStyle w:val="ListParagraph"/>
+        <w:numPr>
+          <w:ilvl w:val="0"/>
+          <w:numId w:val="8"/>
+        </w:numPr>
+        <w:rPr>
+          <w:rFonts w:ascii="Lucida Bright" w:hAnsi="Lucida Bright"/>
+        </w:rPr>
+      </w:pPr>
+      <w:r>
+        <w:rPr>
+          <w:rFonts w:ascii="Lucida Bright" w:hAnsi="Lucida Bright"/>
+        </w:rPr>
+        <w:t>Run the Physics Integrator.</w:t>
+      </w:r>
+    </w:p>
+    <w:p>
+      <w:pPr>
+        <w:pStyle w:val="ListParagraph"/>
+        <w:numPr>
+          <w:ilvl w:val="0"/>
+          <w:numId w:val="8"/>
+        </w:numPr>
+        <w:rPr>
+          <w:rFonts w:ascii="Lucida Bright" w:hAnsi="Lucida Bright"/>
+        </w:rPr>
+      </w:pPr>
+      <w:r>
+        <w:rPr>
+          <w:rFonts w:ascii="Lucida Bright" w:hAnsi="Lucida Bright"/>
+        </w:rPr>
+        <w:t>*</w:t>
+      </w:r>
+      <w:r>
+        <w:rPr>
+          <w:rFonts w:ascii="Lucida Bright" w:hAnsi="Lucida Bright"/>
+        </w:rPr>
+        <w:t xml:space="preserve">Execute </w:t>
+      </w:r>
+      <w:proofErr w:type="spellStart"/>
+      <w:r>
+        <w:rPr>
+          <w:rFonts w:ascii="Lucida Bright" w:hAnsi="Lucida Bright"/>
+        </w:rPr>
+        <w:t>InterScripts</w:t>
+      </w:r>
+      <w:proofErr w:type="spellEnd"/>
+      <w:r>
+        <w:rPr>
+          <w:rFonts w:ascii="Lucida Bright" w:hAnsi="Lucida Bright"/>
+        </w:rPr>
+        <w:t xml:space="preserve"> in the index.</w:t>
+      </w:r>
+    </w:p>
+    <w:p>
+      <w:pPr>
+        <w:pStyle w:val="ListParagraph"/>
+        <w:numPr>
+          <w:ilvl w:val="0"/>
+          <w:numId w:val="8"/>
+        </w:numPr>
+        <w:rPr>
+          <w:rFonts w:ascii="Lucida Bright" w:hAnsi="Lucida Bright"/>
+        </w:rPr>
+      </w:pPr>
+      <w:r>
+        <w:rPr>
+          <w:rFonts w:ascii="Lucida Bright" w:hAnsi="Lucida Bright"/>
+        </w:rPr>
+        <w:t>Run the Collision Detector, returning a list of collision artefacts.</w:t>
+      </w:r>
+    </w:p>
+    <w:p>
+      <w:pPr>
+        <w:pStyle w:val="ListParagraph"/>
+        <w:numPr>
+          <w:ilvl w:val="0"/>
+          <w:numId w:val="8"/>
+        </w:numPr>
+        <w:rPr>
+          <w:rFonts w:ascii="Lucida Bright" w:hAnsi="Lucida Bright"/>
+        </w:rPr>
+      </w:pPr>
+      <w:r>
+        <w:rPr>
+          <w:rFonts w:ascii="Lucida Bright" w:hAnsi="Lucida Bright"/>
+        </w:rPr>
+        <w:t>*</w:t>
+      </w:r>
+      <w:r>
+        <w:rPr>
+          <w:rFonts w:ascii="Lucida Bright" w:hAnsi="Lucida Bright"/>
+        </w:rPr>
+        <w:t xml:space="preserve">Execute </w:t>
+      </w:r>
+      <w:proofErr w:type="spellStart"/>
+      <w:r>
+        <w:rPr>
+          <w:rFonts w:ascii="Lucida Bright" w:hAnsi="Lucida Bright"/>
+        </w:rPr>
+        <w:t>Precollide</w:t>
+      </w:r>
+      <w:proofErr w:type="spellEnd"/>
+      <w:r>
+        <w:rPr>
+          <w:rFonts w:ascii="Lucida Bright" w:hAnsi="Lucida Bright"/>
+        </w:rPr>
+        <w:t xml:space="preserve"> scripts for each object involved in </w:t>
+      </w:r>
+      <w:r>
+        <w:rPr>
+          <w:rFonts w:ascii="Lucida Bright" w:hAnsi="Lucida Bright"/>
+        </w:rPr>
+        <w:t>each</w:t>
+      </w:r>
+      <w:r>
+        <w:rPr>
+          <w:rFonts w:ascii="Lucida Bright" w:hAnsi="Lucida Bright"/>
+        </w:rPr>
+        <w:t xml:space="preserve"> collision.</w:t>
+      </w:r>
+    </w:p>
+    <w:p>
+      <w:pPr>
+        <w:pStyle w:val="ListParagraph"/>
+        <w:numPr>
+          <w:ilvl w:val="0"/>
+          <w:numId w:val="8"/>
+        </w:numPr>
+        <w:rPr>
+          <w:rFonts w:ascii="Lucida Bright" w:hAnsi="Lucida Bright"/>
+        </w:rPr>
+      </w:pPr>
+      <w:r>
+        <w:rPr>
+          <w:rFonts w:ascii="Lucida Bright" w:hAnsi="Lucida Bright"/>
+        </w:rPr>
+        <w:t>Run the Physics Solver.</w:t>
+      </w:r>
+    </w:p>
+    <w:p>
+      <w:pPr>
+        <w:pStyle w:val="ListParagraph"/>
+        <w:numPr>
+          <w:ilvl w:val="0"/>
+          <w:numId w:val="8"/>
+        </w:numPr>
+        <w:rPr>
+          <w:rFonts w:ascii="Lucida Bright" w:hAnsi="Lucida Bright"/>
+        </w:rPr>
+      </w:pPr>
+      <w:r>
+        <w:rPr>
+          <w:rFonts w:ascii="Lucida Bright" w:hAnsi="Lucida Bright"/>
+        </w:rPr>
+        <w:t>*</w:t>
+      </w:r>
+      <w:r>
+        <w:rPr>
+          <w:rFonts w:ascii="Lucida Bright" w:hAnsi="Lucida Bright"/>
+        </w:rPr>
+        <w:t xml:space="preserve">Execute </w:t>
+      </w:r>
+      <w:proofErr w:type="spellStart"/>
+      <w:r>
+        <w:rPr>
+          <w:rFonts w:ascii="Lucida Bright" w:hAnsi="Lucida Bright"/>
+        </w:rPr>
+        <w:t>P</w:t>
+      </w:r>
+      <w:r>
+        <w:rPr>
+          <w:rFonts w:ascii="Lucida Bright" w:hAnsi="Lucida Bright"/>
+        </w:rPr>
+        <w:t>ost</w:t>
+      </w:r>
+      <w:r>
+        <w:rPr>
+          <w:rFonts w:ascii="Lucida Bright" w:hAnsi="Lucida Bright"/>
+        </w:rPr>
+        <w:t>collide</w:t>
+      </w:r>
+      <w:proofErr w:type="spellEnd"/>
+      <w:r>
+        <w:rPr>
+          <w:rFonts w:ascii="Lucida Bright" w:hAnsi="Lucida Bright"/>
+        </w:rPr>
+        <w:t xml:space="preserve"> scripts for each object involved in </w:t>
+      </w:r>
+      <w:r>
+        <w:rPr>
+          <w:rFonts w:ascii="Lucida Bright" w:hAnsi="Lucida Bright"/>
+        </w:rPr>
+        <w:t>each</w:t>
+      </w:r>
+      <w:r>
+        <w:rPr>
+          <w:rFonts w:ascii="Lucida Bright" w:hAnsi="Lucida Bright"/>
+        </w:rPr>
+        <w:t xml:space="preserve"> collision.</w:t>
+      </w:r>
+    </w:p>
+    <w:p>
+      <w:pPr>
+        <w:pStyle w:val="ListParagraph"/>
+        <w:numPr>
+          <w:ilvl w:val="0"/>
+          <w:numId w:val="8"/>
+        </w:numPr>
+        <w:rPr>
+          <w:rFonts w:ascii="Lucida Bright" w:hAnsi="Lucida Bright"/>
+        </w:rPr>
+      </w:pPr>
+      <w:r>
+        <w:rPr>
+          <w:rFonts w:ascii="Lucida Bright" w:hAnsi="Lucida Bright"/>
+        </w:rPr>
+        <w:t>*</w:t>
+      </w:r>
+      <w:r>
+        <w:rPr>
+          <w:rFonts w:ascii="Lucida Bright" w:hAnsi="Lucida Bright"/>
+        </w:rPr>
+        <w:t xml:space="preserve">Execute </w:t>
+      </w:r>
+      <w:proofErr w:type="spellStart"/>
+      <w:r>
+        <w:rPr>
+          <w:rFonts w:ascii="Lucida Bright" w:hAnsi="Lucida Bright"/>
+        </w:rPr>
+        <w:t>PostScripts</w:t>
+      </w:r>
+      <w:proofErr w:type="spellEnd"/>
+      <w:r>
+        <w:rPr>
+          <w:rFonts w:ascii="Lucida Bright" w:hAnsi="Lucida Bright"/>
+        </w:rPr>
+        <w:t xml:space="preserve"> in the index</w:t>
+      </w:r>
+      <w:r>
+        <w:rPr>
+          <w:rFonts w:ascii="Lucida Bright" w:hAnsi="Lucida Bright"/>
+        </w:rPr>
+        <w:t>.</w:t>
+      </w:r>
+    </w:p>
+    <w:p>
+      <w:pPr>
+        <w:pStyle w:val="ListParagraph"/>
+        <w:numPr>
+          <w:ilvl w:val="0"/>
+          <w:numId w:val="8"/>
+        </w:numPr>
+        <w:rPr>
+          <w:rFonts w:ascii="Lucida Bright" w:hAnsi="Lucida Bright"/>
+        </w:rPr>
+      </w:pPr>
+      <w:r>
+        <w:rPr>
+          <w:rFonts w:ascii="Lucida Bright" w:hAnsi="Lucida Bright"/>
+        </w:rPr>
+        <w:t>Remove any deleted keys from the index</w:t>
+      </w:r>
+      <w:r>
+        <w:rPr>
+          <w:rFonts w:ascii="Lucida Bright" w:hAnsi="Lucida Bright"/>
+        </w:rPr>
+        <w:t>.</w:t>
+      </w:r>
+    </w:p>
+    <w:p>
+      <w:pPr>
+        <w:rPr>
+          <w:rFonts w:ascii="Lucida Bright" w:hAnsi="Lucida Bright"/>
+        </w:rPr>
+      </w:pPr>
+      <w:r>
+        <w:rPr>
+          <w:rFonts w:ascii="Lucida Bright" w:hAnsi="Lucida Bright"/>
+        </w:rPr>
+        <w:t xml:space="preserve">Steps marked with an asterisk execute scripts written and added to objects as props. </w:t>
+      </w:r>
+    </w:p>
+    <w:p>
+      <w:pPr>
+        <w:rPr>
+          <w:rFonts w:ascii="Lucida Bright" w:hAnsi="Lucida Bright"/>
+        </w:rPr>
+      </w:pPr>
+      <w:r>
+        <w:rPr>
+          <w:rFonts w:ascii="Lucida Bright" w:hAnsi="Lucida Bright"/>
+        </w:rPr>
+        <w:t xml:space="preserve">The draw step is implemented by a call to the Painter class which draws all game objects in the index and then calls the Canvas from the </w:t>
+      </w:r>
+      <w:proofErr w:type="spellStart"/>
+      <w:r>
+        <w:rPr>
+          <w:rFonts w:ascii="Lucida Bright" w:hAnsi="Lucida Bright"/>
+        </w:rPr>
+        <w:t>LevelFile</w:t>
+      </w:r>
+      <w:proofErr w:type="spellEnd"/>
+      <w:r>
+        <w:rPr>
+          <w:rFonts w:ascii="Lucida Bright" w:hAnsi="Lucida Bright"/>
+        </w:rPr>
+        <w:t xml:space="preserve"> to add any final touches and draw the graphical user interface.</w:t>
+      </w:r>
+      <w:r>
+        <w:rPr>
+          <w:rFonts w:ascii="Lucida Bright" w:hAnsi="Lucida Bright"/>
+        </w:rPr>
+        <w:t xml:space="preserve"> Painter uses the Renderer to perform these functions.</w:t>
+      </w:r>
+    </w:p>
+    <w:p/>
+    <w:p>
+      <w:pPr>
+        <w:rPr>
+          <w:b/>
+          <w:bCs/>
+        </w:rPr>
+      </w:pPr>
+      <w:r>
+        <w:rPr>
+          <w:b/>
+          <w:bCs/>
+        </w:rPr>
+        <w:t>REFLECTION – ROOM FOR IMPROVEMENT</w:t>
       </w:r>
     </w:p>
     <w:p>
@@ -993,52 +2568,34 @@
           <w:ilvl w:val="0"/>
           <w:numId w:val="6"/>
         </w:numPr>
-        <w:spacing w:after="0"/>
-        <w:rPr>
-          <w:rFonts w:ascii="Lucida Bright" w:hAnsi="Lucida Bright"/>
-        </w:rPr>
-      </w:pPr>
-      <w:proofErr w:type="spellStart"/>
-      <w:r>
-        <w:rPr>
-          <w:rFonts w:ascii="Lucida Bright" w:hAnsi="Lucida Bright"/>
-        </w:rPr>
-        <w:t>Game.update</w:t>
-      </w:r>
-      <w:proofErr w:type="spellEnd"/>
-      <w:r>
-        <w:rPr>
-          <w:rFonts w:ascii="Lucida Bright" w:hAnsi="Lucida Bright"/>
-        </w:rPr>
-        <w:t xml:space="preserve">() controls the menu in response to user input (via Controller) and calls </w:t>
-      </w:r>
-      <w:proofErr w:type="spellStart"/>
-      <w:r>
-        <w:rPr>
-          <w:rFonts w:ascii="Lucida Bright" w:hAnsi="Lucida Bright"/>
-        </w:rPr>
-        <w:t>Level.update</w:t>
-      </w:r>
-      <w:proofErr w:type="spellEnd"/>
-      <w:r>
-        <w:rPr>
-          <w:rFonts w:ascii="Lucida Bright" w:hAnsi="Lucida Bright"/>
-        </w:rPr>
-        <w:t>(), which itself manages level data in response time between frames (</w:t>
-      </w:r>
-      <w:proofErr w:type="spellStart"/>
-      <w:r>
-        <w:rPr>
-          <w:rFonts w:ascii="Lucida Bright" w:hAnsi="Lucida Bright"/>
-        </w:rPr>
-        <w:t>Renderer.dTime</w:t>
-      </w:r>
-      <w:proofErr w:type="spellEnd"/>
-      <w:r>
-        <w:rPr>
-          <w:rFonts w:ascii="Lucida Bright" w:hAnsi="Lucida Bright"/>
-        </w:rPr>
-        <w:t xml:space="preserve">) as well as user input. </w:t>
+      </w:pPr>
+      <w:r>
+        <w:t xml:space="preserve">While the property-centric architecture makes </w:t>
+      </w:r>
+      <w:proofErr w:type="spellStart"/>
+      <w:r>
+        <w:t>paralellization</w:t>
+      </w:r>
+      <w:proofErr w:type="spellEnd"/>
+      <w:r>
+        <w:t xml:space="preserve"> </w:t>
+      </w:r>
+      <w:r>
+        <w:t>easy</w:t>
+      </w:r>
+      <w:r>
+        <w:t xml:space="preserve"> this feature has </w:t>
+      </w:r>
+      <w:proofErr w:type="gramStart"/>
+      <w:r>
+        <w:t>not  yet</w:t>
+      </w:r>
+      <w:proofErr w:type="gramEnd"/>
+      <w:r>
+        <w:t xml:space="preserve"> been implemented. </w:t>
+      </w:r>
+      <w:r>
+        <w:t>Costly physics calculations are made on the CPU rather than in batches on the GPU. CUDA appears to be the obvious tool for this.</w:t>
       </w:r>
     </w:p>
     <w:p>
@@ -1048,49 +2605,38 @@
           <w:ilvl w:val="0"/>
           <w:numId w:val="6"/>
         </w:numPr>
-        <w:spacing w:after="0"/>
-        <w:rPr>
-          <w:rFonts w:ascii="Lucida Bright" w:hAnsi="Lucida Bright"/>
-        </w:rPr>
-      </w:pPr>
-      <w:proofErr w:type="spellStart"/>
-      <w:r>
-        <w:rPr>
-          <w:rFonts w:ascii="Lucida Bright" w:hAnsi="Lucida Bright"/>
-        </w:rPr>
-        <w:t>Game.draw</w:t>
-      </w:r>
-      <w:proofErr w:type="spellEnd"/>
-      <w:r>
-        <w:rPr>
-          <w:rFonts w:ascii="Lucida Bright" w:hAnsi="Lucida Bright"/>
-        </w:rPr>
-        <w:t xml:space="preserve">() draws the menu and calls </w:t>
-      </w:r>
-      <w:proofErr w:type="spellStart"/>
-      <w:r>
-        <w:rPr>
-          <w:rFonts w:ascii="Lucida Bright" w:hAnsi="Lucida Bright"/>
-        </w:rPr>
-        <w:t>Level.draw</w:t>
-      </w:r>
-      <w:proofErr w:type="spellEnd"/>
-      <w:r>
-        <w:rPr>
-          <w:rFonts w:ascii="Lucida Bright" w:hAnsi="Lucida Bright"/>
-        </w:rPr>
-        <w:t>() to draw level data to the frame buffer (using Renderer’s draw functions).</w:t>
-      </w:r>
-    </w:p>
-    <w:p>
-      <w:pPr>
-        <w:spacing w:after="0"/>
-        <w:rPr>
-          <w:rFonts w:ascii="Lucida Bright" w:hAnsi="Lucida Bright"/>
-        </w:rPr>
-      </w:pPr>
-    </w:p>
-    <w:p/>
+      </w:pPr>
+      <w:r>
+        <w:t>Collision detection is not continuous. Objects that are fast enough can pass through brick walls as if they weren’t there.</w:t>
+      </w:r>
+    </w:p>
+    <w:p>
+      <w:pPr>
+        <w:pStyle w:val="ListParagraph"/>
+        <w:numPr>
+          <w:ilvl w:val="0"/>
+          <w:numId w:val="6"/>
+        </w:numPr>
+      </w:pPr>
+      <w:r>
+        <w:t>Collision artefact is a separation vector and two contact points. Contact manifolds (surfaces) would be ideal and make for more accurate calculations.</w:t>
+      </w:r>
+    </w:p>
+    <w:p>
+      <w:pPr>
+        <w:pStyle w:val="ListParagraph"/>
+        <w:numPr>
+          <w:ilvl w:val="0"/>
+          <w:numId w:val="6"/>
+        </w:numPr>
+      </w:pPr>
+      <w:r>
+        <w:t>Constraint solver is iterative – weak. It should work on the GPU and solve constraints in</w:t>
+      </w:r>
+      <w:r>
+        <w:t xml:space="preserve"> groups based on distance chunking.</w:t>
+      </w:r>
+    </w:p>
     <w:sectPr>
       <w:pgSz w:w="12240" w:h="15840"/>
       <w:pgMar w:top="1440" w:right="1440" w:bottom="1440" w:left="1440" w:header="708" w:footer="708" w:gutter="0"/>
@@ -1112,7 +2658,7 @@
       <w:lvlText w:val="-"/>
       <w:lvlJc w:val="left"/>
       <w:pPr>
-        <w:ind w:left="720" w:hanging="360"/>
+        <w:ind w:left="360" w:hanging="360"/>
       </w:pPr>
       <w:rPr>
         <w:rFonts w:ascii="Lucida Bright" w:eastAsiaTheme="minorEastAsia" w:hAnsi="Lucida Bright" w:cstheme="minorBidi" w:hint="default"/>
@@ -1587,6 +3133,95 @@
     </w:lvl>
   </w:abstractNum>
   <w:abstractNum w:abstractNumId="5" w15:restartNumberingAfterBreak="0">
+    <w:nsid w:val="443B528D"/>
+    <w:multiLevelType w:val="hybridMultilevel"/>
+    <w:tmpl w:val="E80806C6"/>
+    <w:lvl w:ilvl="0" w:tplc="1009000F">
+      <w:start w:val="1"/>
+      <w:numFmt w:val="decimal"/>
+      <w:lvlText w:val="%1."/>
+      <w:lvlJc w:val="left"/>
+      <w:pPr>
+        <w:ind w:left="720" w:hanging="360"/>
+      </w:pPr>
+      <w:rPr>
+        <w:rFonts w:hint="default"/>
+      </w:rPr>
+    </w:lvl>
+    <w:lvl w:ilvl="1" w:tplc="10090019" w:tentative="1">
+      <w:start w:val="1"/>
+      <w:numFmt w:val="lowerLetter"/>
+      <w:lvlText w:val="%2."/>
+      <w:lvlJc w:val="left"/>
+      <w:pPr>
+        <w:ind w:left="1440" w:hanging="360"/>
+      </w:pPr>
+    </w:lvl>
+    <w:lvl w:ilvl="2" w:tplc="1009001B" w:tentative="1">
+      <w:start w:val="1"/>
+      <w:numFmt w:val="lowerRoman"/>
+      <w:lvlText w:val="%3."/>
+      <w:lvlJc w:val="right"/>
+      <w:pPr>
+        <w:ind w:left="2160" w:hanging="180"/>
+      </w:pPr>
+    </w:lvl>
+    <w:lvl w:ilvl="3" w:tplc="1009000F" w:tentative="1">
+      <w:start w:val="1"/>
+      <w:numFmt w:val="decimal"/>
+      <w:lvlText w:val="%4."/>
+      <w:lvlJc w:val="left"/>
+      <w:pPr>
+        <w:ind w:left="2880" w:hanging="360"/>
+      </w:pPr>
+    </w:lvl>
+    <w:lvl w:ilvl="4" w:tplc="10090019" w:tentative="1">
+      <w:start w:val="1"/>
+      <w:numFmt w:val="lowerLetter"/>
+      <w:lvlText w:val="%5."/>
+      <w:lvlJc w:val="left"/>
+      <w:pPr>
+        <w:ind w:left="3600" w:hanging="360"/>
+      </w:pPr>
+    </w:lvl>
+    <w:lvl w:ilvl="5" w:tplc="1009001B" w:tentative="1">
+      <w:start w:val="1"/>
+      <w:numFmt w:val="lowerRoman"/>
+      <w:lvlText w:val="%6."/>
+      <w:lvlJc w:val="right"/>
+      <w:pPr>
+        <w:ind w:left="4320" w:hanging="180"/>
+      </w:pPr>
+    </w:lvl>
+    <w:lvl w:ilvl="6" w:tplc="1009000F" w:tentative="1">
+      <w:start w:val="1"/>
+      <w:numFmt w:val="decimal"/>
+      <w:lvlText w:val="%7."/>
+      <w:lvlJc w:val="left"/>
+      <w:pPr>
+        <w:ind w:left="5040" w:hanging="360"/>
+      </w:pPr>
+    </w:lvl>
+    <w:lvl w:ilvl="7" w:tplc="10090019" w:tentative="1">
+      <w:start w:val="1"/>
+      <w:numFmt w:val="lowerLetter"/>
+      <w:lvlText w:val="%8."/>
+      <w:lvlJc w:val="left"/>
+      <w:pPr>
+        <w:ind w:left="5760" w:hanging="360"/>
+      </w:pPr>
+    </w:lvl>
+    <w:lvl w:ilvl="8" w:tplc="1009001B" w:tentative="1">
+      <w:start w:val="1"/>
+      <w:numFmt w:val="lowerRoman"/>
+      <w:lvlText w:val="%9."/>
+      <w:lvlJc w:val="right"/>
+      <w:pPr>
+        <w:ind w:left="6480" w:hanging="180"/>
+      </w:pPr>
+    </w:lvl>
+  </w:abstractNum>
+  <w:abstractNum w:abstractNumId="6" w15:restartNumberingAfterBreak="0">
     <w:nsid w:val="72934D09"/>
     <w:multiLevelType w:val="hybridMultilevel"/>
     <w:tmpl w:val="2F2ADDBA"/>
@@ -1672,7 +3307,7 @@
       </w:pPr>
     </w:lvl>
   </w:abstractNum>
-  <w:abstractNum w:abstractNumId="6" w15:restartNumberingAfterBreak="0">
+  <w:abstractNum w:abstractNumId="7" w15:restartNumberingAfterBreak="0">
     <w:nsid w:val="7BAD681E"/>
     <w:multiLevelType w:val="hybridMultilevel"/>
     <w:tmpl w:val="2AE8930A"/>
@@ -1759,13 +3394,13 @@
     </w:lvl>
   </w:abstractNum>
   <w:num w:numId="1" w16cid:durableId="1663582919">
-    <w:abstractNumId w:val="6"/>
+    <w:abstractNumId w:val="7"/>
   </w:num>
   <w:num w:numId="2" w16cid:durableId="1424494874">
     <w:abstractNumId w:val="4"/>
   </w:num>
   <w:num w:numId="3" w16cid:durableId="202792158">
-    <w:abstractNumId w:val="5"/>
+    <w:abstractNumId w:val="6"/>
   </w:num>
   <w:num w:numId="4" w16cid:durableId="2137134552">
     <w:abstractNumId w:val="2"/>
@@ -1778,6 +3413,9 @@
   </w:num>
   <w:num w:numId="7" w16cid:durableId="74127841">
     <w:abstractNumId w:val="1"/>
+  </w:num>
+  <w:num w:numId="8" w16cid:durableId="733434678">
+    <w:abstractNumId w:val="5"/>
   </w:num>
 </w:numbering>
 </file>
@@ -2711,6 +4349,18 @@
       <w:u w:val="single"/>
     </w:rPr>
   </w:style>
+  <w:style w:type="character" w:styleId="UnresolvedMention">
+    <w:name w:val="Unresolved Mention"/>
+    <w:basedOn w:val="DefaultParagraphFont"/>
+    <w:uiPriority w:val="99"/>
+    <w:semiHidden/>
+    <w:unhideWhenUsed/>
+    <w:rsid w:val="00AD4D44"/>
+    <w:rPr>
+      <w:color w:val="605E5C"/>
+      <w:shd w:val="clear" w:color="auto" w:fill="E1DFDD"/>
+    </w:rPr>
+  </w:style>
 </w:styles>
 </file>
 

</xml_diff>

<commit_message>
Release for March 2026
-Added dependencies file with up-to-date packages
-NumPy removed: After several hours of research and troubleshooting it was discovered that somehow, somewhere in the sequence of releases of NumPy (or PyGLM), a change was made so that the numpy.array method, when applied to a glm matrix, would transpose the matrix where it had not before. In retaliation, we have removed NumPy as a dependency from this project entirely and replaced it with our own methods using ctypes in native Python.
-PyGame-CE to replace PyGame: PyGame has no release for current versions of Python. We have switched to Pygame-CE. As a result, we had to edit the Controller class with regard to handling input and also implemented a rudimentary controls mapping system.
-Fixed SpotLight implementation
-Created bindBuffers function in ResourceManager (refactoring)
</commit_message>
<xml_diff>
--- a/documentation.docx
+++ b/documentation.docx
@@ -282,12 +282,14 @@
         </w:numPr>
         <w:rPr>
           <w:rFonts w:ascii="Lucida Bright" w:hAnsi="Lucida Bright"/>
-        </w:rPr>
-      </w:pPr>
-      <w:proofErr w:type="spellStart"/>
-      <w:r>
-        <w:rPr>
-          <w:rFonts w:ascii="Lucida Bright" w:hAnsi="Lucida Bright"/>
+          <w:strike/>
+        </w:rPr>
+      </w:pPr>
+      <w:proofErr w:type="spellStart"/>
+      <w:r>
+        <w:rPr>
+          <w:rFonts w:ascii="Lucida Bright" w:hAnsi="Lucida Bright"/>
+          <w:strike/>
         </w:rPr>
         <w:t>Numpy</w:t>
       </w:r>
@@ -295,6 +297,7 @@
       <w:r>
         <w:rPr>
           <w:rFonts w:ascii="Lucida Bright" w:hAnsi="Lucida Bright"/>
+          <w:strike/>
         </w:rPr>
         <w:t xml:space="preserve"> – used in Renderer and </w:t>
       </w:r>
@@ -302,6 +305,7 @@
       <w:r>
         <w:rPr>
           <w:rFonts w:ascii="Lucida Bright" w:hAnsi="Lucida Bright"/>
+          <w:strike/>
         </w:rPr>
         <w:t>ResourceManager</w:t>
       </w:r>
@@ -309,6 +313,7 @@
       <w:r>
         <w:rPr>
           <w:rFonts w:ascii="Lucida Bright" w:hAnsi="Lucida Bright"/>
+          <w:strike/>
         </w:rPr>
         <w:t xml:space="preserve"> classes to load data into OpenGL (https://pypi.org/project/numpy/</w:t>
       </w:r>
@@ -317,6 +322,7 @@
           <w:rFonts w:ascii="Lucida Bright" w:hAnsi="Lucida Bright"/>
           <w:b/>
           <w:bCs/>
+          <w:strike/>
         </w:rPr>
         <w:t>)</w:t>
       </w:r>
@@ -492,13 +498,7 @@
         <w:rPr>
           <w:rFonts w:ascii="Lucida Bright" w:hAnsi="Lucida Bright"/>
         </w:rPr>
-        <w:t>Config, constants</w:t>
-      </w:r>
-      <w:r>
-        <w:rPr>
-          <w:rFonts w:ascii="Lucida Bright" w:hAnsi="Lucida Bright"/>
-        </w:rPr>
-        <w:t>:</w:t>
+        <w:t>Config, constants:</w:t>
       </w:r>
     </w:p>
     <w:p>
@@ -619,19 +619,7 @@
         <w:rPr>
           <w:rFonts w:ascii="Lucida Bright" w:hAnsi="Lucida Bright"/>
         </w:rPr>
-        <w:t>contains all the fonts, meshes (3D models, as obj files), textures (images), and shader files (</w:t>
-      </w:r>
-      <w:r>
-        <w:rPr>
-          <w:rFonts w:ascii="Lucida Bright" w:hAnsi="Lucida Bright"/>
-        </w:rPr>
-        <w:t>GLSL</w:t>
-      </w:r>
-      <w:r>
-        <w:rPr>
-          <w:rFonts w:ascii="Lucida Bright" w:hAnsi="Lucida Bright"/>
-        </w:rPr>
-        <w:t xml:space="preserve"> programs), needed for rendering the game. Also holds level files for building and running levels and scripts for game objects.</w:t>
+        <w:t>contains all the fonts, meshes (3D models, as obj files), textures (images), and shader files (GLSL programs), needed for rendering the game. Also holds level files for building and running levels and scripts for game objects.</w:t>
       </w:r>
     </w:p>
     <w:p>
@@ -653,13 +641,7 @@
         <w:rPr>
           <w:rFonts w:ascii="Lucida Bright" w:hAnsi="Lucida Bright"/>
         </w:rPr>
-        <w:t>Main</w:t>
-      </w:r>
-      <w:r>
-        <w:rPr>
-          <w:rFonts w:ascii="Lucida Bright" w:hAnsi="Lucida Bright"/>
-        </w:rPr>
-        <w:t>:</w:t>
+        <w:t>Main:</w:t>
       </w:r>
     </w:p>
     <w:p>
@@ -1461,13 +1443,7 @@
         <w:rPr>
           <w:rFonts w:ascii="Lucida Bright" w:hAnsi="Lucida Bright"/>
         </w:rPr>
-        <w:t xml:space="preserve"> </w:t>
-      </w:r>
-      <w:r>
-        <w:rPr>
-          <w:rFonts w:ascii="Lucida Bright" w:hAnsi="Lucida Bright"/>
-        </w:rPr>
-        <w:t>is a class stored in assets/levels with three static references</w:t>
+        <w:t xml:space="preserve"> is a class stored in assets/levels with three static references</w:t>
       </w:r>
       <w:r>
         <w:rPr>
@@ -2336,19 +2312,7 @@
         <w:rPr>
           <w:rFonts w:ascii="Lucida Bright" w:hAnsi="Lucida Bright"/>
         </w:rPr>
-        <w:t xml:space="preserve"> scripts for each object involved in </w:t>
-      </w:r>
-      <w:r>
-        <w:rPr>
-          <w:rFonts w:ascii="Lucida Bright" w:hAnsi="Lucida Bright"/>
-        </w:rPr>
-        <w:t>each</w:t>
-      </w:r>
-      <w:r>
-        <w:rPr>
-          <w:rFonts w:ascii="Lucida Bright" w:hAnsi="Lucida Bright"/>
-        </w:rPr>
-        <w:t xml:space="preserve"> collision.</w:t>
+        <w:t xml:space="preserve"> scripts for each object involved in each collision.</w:t>
       </w:r>
     </w:p>
     <w:p>
@@ -2397,38 +2361,14 @@
         <w:rPr>
           <w:rFonts w:ascii="Lucida Bright" w:hAnsi="Lucida Bright"/>
         </w:rPr>
-        <w:t>P</w:t>
-      </w:r>
-      <w:r>
-        <w:rPr>
-          <w:rFonts w:ascii="Lucida Bright" w:hAnsi="Lucida Bright"/>
-        </w:rPr>
-        <w:t>ost</w:t>
-      </w:r>
-      <w:r>
-        <w:rPr>
-          <w:rFonts w:ascii="Lucida Bright" w:hAnsi="Lucida Bright"/>
-        </w:rPr>
-        <w:t>collide</w:t>
-      </w:r>
-      <w:proofErr w:type="spellEnd"/>
-      <w:r>
-        <w:rPr>
-          <w:rFonts w:ascii="Lucida Bright" w:hAnsi="Lucida Bright"/>
-        </w:rPr>
-        <w:t xml:space="preserve"> scripts for each object involved in </w:t>
-      </w:r>
-      <w:r>
-        <w:rPr>
-          <w:rFonts w:ascii="Lucida Bright" w:hAnsi="Lucida Bright"/>
-        </w:rPr>
-        <w:t>each</w:t>
-      </w:r>
-      <w:r>
-        <w:rPr>
-          <w:rFonts w:ascii="Lucida Bright" w:hAnsi="Lucida Bright"/>
-        </w:rPr>
-        <w:t xml:space="preserve"> collision.</w:t>
+        <w:t>Postcollide</w:t>
+      </w:r>
+      <w:proofErr w:type="spellEnd"/>
+      <w:r>
+        <w:rPr>
+          <w:rFonts w:ascii="Lucida Bright" w:hAnsi="Lucida Bright"/>
+        </w:rPr>
+        <w:t xml:space="preserve"> scripts for each object involved in each collision.</w:t>
       </w:r>
     </w:p>
     <w:p>

</xml_diff>